<commit_message>
mejoras planificacion y vista jefe conjunto manual
</commit_message>
<xml_diff>
--- a/scout_management/doc/Manual_de_uso_Gestion_Grupo_Scout.docx
+++ b/scout_management/doc/Manual_de_uso_Gestion_Grupo_Scout.docx
@@ -4859,7 +4859,7 @@
                 <w:b w:val="false"/>
                 <w:bCs w:val="false"/>
               </w:rPr>
-              <w:t xml:space="preserve">Cada sábado del trimestre: "Crear las sesiones de los sábados que faltan" y luego tocar cada una para ponerle nombre, mística, objetivos, lugar y responsables. Avisa en rojo las que no tienen temática. PDF del programa trimestral.</w:t>
+              <w:t xml:space="preserve">Cada sábado del trimestre con su botón "Planear": abre en una sola pantalla los datos de la sesión (nombre, horario, tipo, mística, objetivos, lugar, responsables) y el programa con dictado por voz. "Vie–Dom" anexa un campamento y "Otra fecha" cualquier otro día. Avisa en rojo las sesiones sin temática. PDF del programa trimestral.</w:t>
             </w:r>
           </w:p>
         </w:tc>
@@ -4971,7 +4971,7 @@
                 <w:b w:val="false"/>
                 <w:bCs w:val="false"/>
               </w:rPr>
-              <w:t xml:space="preserve">Elige la insignia o adelanto, toca a los que lo lograron (o lo empiezan) y registra a todos de una vez.</w:t>
+              <w:t xml:space="preserve">Elige el grupo (adelantos o una categoría de especialidades) y la insignia, toca a los que lo lograron (o lo empiezan) y registra a todos de una vez.</w:t>
             </w:r>
           </w:p>
         </w:tc>
@@ -5214,6 +5214,1825 @@
     </w:p>
     <w:p>
       <w:pPr>
+        <w:pStyle w:val="Heading2"/>
+      </w:pPr>
+      <w:r>
+        <w:t xml:space="preserve">Patrullas, logros, credencial y calendario del grupo</w:t>
+      </w:r>
+    </w:p>
+    <w:tbl>
+      <w:tblPr>
+        <w:tblW w:type="dxa" w:w="9360"/>
+        <w:tblBorders>
+          <w:top w:val="single" w:color="auto" w:sz="4"/>
+          <w:left w:val="single" w:color="auto" w:sz="4"/>
+          <w:bottom w:val="single" w:color="auto" w:sz="4"/>
+          <w:right w:val="single" w:color="auto" w:sz="4"/>
+          <w:insideH w:val="single" w:color="auto" w:sz="4"/>
+          <w:insideV w:val="single" w:color="auto" w:sz="4"/>
+        </w:tblBorders>
+      </w:tblPr>
+      <w:tblGrid>
+        <w:gridCol w:w="2300"/>
+        <w:gridCol w:w="7060"/>
+      </w:tblGrid>
+      <w:tr>
+        <w:trPr>
+          <w:tblHeader/>
+        </w:trPr>
+        <w:tc>
+          <w:tcPr>
+            <w:tcW w:type="dxa" w:w="2300"/>
+            <w:tcBorders>
+              <w:top w:val="single" w:color="C9CFDF" w:sz="4"/>
+              <w:left w:val="single" w:color="C9CFDF" w:sz="4"/>
+              <w:bottom w:val="single" w:color="C9CFDF" w:sz="4"/>
+              <w:right w:val="single" w:color="C9CFDF" w:sz="4"/>
+            </w:tcBorders>
+            <w:shd w:fill="0F3049" w:color="auto" w:val="clear"/>
+            <w:tcMar>
+              <w:top w:type="dxa" w:w="80"/>
+              <w:left w:type="dxa" w:w="120"/>
+              <w:bottom w:type="dxa" w:w="80"/>
+              <w:right w:type="dxa" w:w="120"/>
+            </w:tcMar>
+          </w:tcPr>
+          <w:p>
+            <w:r>
+              <w:rPr>
+                <w:b/>
+                <w:bCs/>
+                <w:color w:val="FFFFFF"/>
+              </w:rPr>
+              <w:t xml:space="preserve">Pantalla</w:t>
+            </w:r>
+          </w:p>
+        </w:tc>
+        <w:tc>
+          <w:tcPr>
+            <w:tcW w:type="dxa" w:w="7060"/>
+            <w:tcBorders>
+              <w:top w:val="single" w:color="C9CFDF" w:sz="4"/>
+              <w:left w:val="single" w:color="C9CFDF" w:sz="4"/>
+              <w:bottom w:val="single" w:color="C9CFDF" w:sz="4"/>
+              <w:right w:val="single" w:color="C9CFDF" w:sz="4"/>
+            </w:tcBorders>
+            <w:shd w:fill="0F3049" w:color="auto" w:val="clear"/>
+            <w:tcMar>
+              <w:top w:type="dxa" w:w="80"/>
+              <w:left w:type="dxa" w:w="120"/>
+              <w:bottom w:type="dxa" w:w="80"/>
+              <w:right w:type="dxa" w:w="120"/>
+            </w:tcMar>
+          </w:tcPr>
+          <w:p>
+            <w:r>
+              <w:rPr>
+                <w:b/>
+                <w:bCs/>
+                <w:color w:val="FFFFFF"/>
+              </w:rPr>
+              <w:t xml:space="preserve">Qué hace el dirigente</w:t>
+            </w:r>
+          </w:p>
+        </w:tc>
+      </w:tr>
+      <w:tr>
+        <w:tc>
+          <w:tcPr>
+            <w:tcW w:type="dxa" w:w="2300"/>
+            <w:tcBorders>
+              <w:top w:val="single" w:color="C9CFDF" w:sz="4"/>
+              <w:left w:val="single" w:color="C9CFDF" w:sz="4"/>
+              <w:bottom w:val="single" w:color="C9CFDF" w:sz="4"/>
+              <w:right w:val="single" w:color="C9CFDF" w:sz="4"/>
+            </w:tcBorders>
+            <w:shd w:fill="FFFFFF" w:color="auto" w:val="clear"/>
+            <w:tcMar>
+              <w:top w:type="dxa" w:w="80"/>
+              <w:left w:type="dxa" w:w="120"/>
+              <w:bottom w:type="dxa" w:w="80"/>
+              <w:right w:type="dxa" w:w="120"/>
+            </w:tcMar>
+          </w:tcPr>
+          <w:p>
+            <w:r>
+              <w:rPr>
+                <w:b/>
+                <w:bCs/>
+              </w:rPr>
+              <w:t xml:space="preserve">Patrullas / seisenas / madrigueras</w:t>
+            </w:r>
+          </w:p>
+        </w:tc>
+        <w:tc>
+          <w:tcPr>
+            <w:tcW w:type="dxa" w:w="7060"/>
+            <w:tcBorders>
+              <w:top w:val="single" w:color="C9CFDF" w:sz="4"/>
+              <w:left w:val="single" w:color="C9CFDF" w:sz="4"/>
+              <w:bottom w:val="single" w:color="C9CFDF" w:sz="4"/>
+              <w:right w:val="single" w:color="C9CFDF" w:sz="4"/>
+            </w:tcBorders>
+            <w:shd w:fill="FFFFFF" w:color="auto" w:val="clear"/>
+            <w:tcMar>
+              <w:top w:type="dxa" w:w="80"/>
+              <w:left w:type="dxa" w:w="120"/>
+              <w:bottom w:type="dxa" w:w="80"/>
+              <w:right w:type="dxa" w:w="120"/>
+            </w:tcMar>
+          </w:tcPr>
+          <w:p>
+            <w:r>
+              <w:rPr>
+                <w:b w:val="false"/>
+                <w:bCs w:val="false"/>
+              </w:rPr>
+              <w:t xml:space="preserve">Los miembros agrupados por equipo. Toca la ficha de un scout y elige a qué equipo moverlo o nómbralo guía, subguía o integrante (el guía anterior pasa a integrante). En computadora también se arrastra la ficha. Ahí mismo se crea un equipo nuevo con su color.</w:t>
+            </w:r>
+          </w:p>
+        </w:tc>
+      </w:tr>
+      <w:tr>
+        <w:tc>
+          <w:tcPr>
+            <w:tcW w:type="dxa" w:w="2300"/>
+            <w:tcBorders>
+              <w:top w:val="single" w:color="C9CFDF" w:sz="4"/>
+              <w:left w:val="single" w:color="C9CFDF" w:sz="4"/>
+              <w:bottom w:val="single" w:color="C9CFDF" w:sz="4"/>
+              <w:right w:val="single" w:color="C9CFDF" w:sz="4"/>
+            </w:tcBorders>
+            <w:shd w:fill="EEF2F5" w:color="auto" w:val="clear"/>
+            <w:tcMar>
+              <w:top w:type="dxa" w:w="80"/>
+              <w:left w:type="dxa" w:w="120"/>
+              <w:bottom w:type="dxa" w:w="80"/>
+              <w:right w:type="dxa" w:w="120"/>
+            </w:tcMar>
+          </w:tcPr>
+          <w:p>
+            <w:r>
+              <w:rPr>
+                <w:b/>
+                <w:bCs/>
+              </w:rPr>
+              <w:t xml:space="preserve">Miembros (ordenar)</w:t>
+            </w:r>
+          </w:p>
+        </w:tc>
+        <w:tc>
+          <w:tcPr>
+            <w:tcW w:type="dxa" w:w="7060"/>
+            <w:tcBorders>
+              <w:top w:val="single" w:color="C9CFDF" w:sz="4"/>
+              <w:left w:val="single" w:color="C9CFDF" w:sz="4"/>
+              <w:bottom w:val="single" w:color="C9CFDF" w:sz="4"/>
+              <w:right w:val="single" w:color="C9CFDF" w:sz="4"/>
+            </w:tcBorders>
+            <w:shd w:fill="EEF2F5" w:color="auto" w:val="clear"/>
+            <w:tcMar>
+              <w:top w:type="dxa" w:w="80"/>
+              <w:left w:type="dxa" w:w="120"/>
+              <w:bottom w:type="dxa" w:w="80"/>
+              <w:right w:type="dxa" w:w="120"/>
+            </w:tcMar>
+          </w:tcPr>
+          <w:p>
+            <w:r>
+              <w:rPr>
+                <w:b w:val="false"/>
+                <w:bCs w:val="false"/>
+              </w:rPr>
+              <w:t xml:space="preserve">Pestañas para ordenar por equipo, nombre, edad o avisos.</w:t>
+            </w:r>
+          </w:p>
+        </w:tc>
+      </w:tr>
+      <w:tr>
+        <w:tc>
+          <w:tcPr>
+            <w:tcW w:type="dxa" w:w="2300"/>
+            <w:tcBorders>
+              <w:top w:val="single" w:color="C9CFDF" w:sz="4"/>
+              <w:left w:val="single" w:color="C9CFDF" w:sz="4"/>
+              <w:bottom w:val="single" w:color="C9CFDF" w:sz="4"/>
+              <w:right w:val="single" w:color="C9CFDF" w:sz="4"/>
+            </w:tcBorders>
+            <w:shd w:fill="FFFFFF" w:color="auto" w:val="clear"/>
+            <w:tcMar>
+              <w:top w:type="dxa" w:w="80"/>
+              <w:left w:type="dxa" w:w="120"/>
+              <w:bottom w:type="dxa" w:w="80"/>
+              <w:right w:type="dxa" w:w="120"/>
+            </w:tcMar>
+          </w:tcPr>
+          <w:p>
+            <w:r>
+              <w:rPr>
+                <w:b/>
+                <w:bCs/>
+              </w:rPr>
+              <w:t xml:space="preserve">Cuadro de logros</w:t>
+            </w:r>
+          </w:p>
+        </w:tc>
+        <w:tc>
+          <w:tcPr>
+            <w:tcW w:type="dxa" w:w="7060"/>
+            <w:tcBorders>
+              <w:top w:val="single" w:color="C9CFDF" w:sz="4"/>
+              <w:left w:val="single" w:color="C9CFDF" w:sz="4"/>
+              <w:bottom w:val="single" w:color="C9CFDF" w:sz="4"/>
+              <w:right w:val="single" w:color="C9CFDF" w:sz="4"/>
+            </w:tcBorders>
+            <w:shd w:fill="FFFFFF" w:color="auto" w:val="clear"/>
+            <w:tcMar>
+              <w:top w:type="dxa" w:w="80"/>
+              <w:left w:type="dxa" w:w="120"/>
+              <w:bottom w:type="dxa" w:w="80"/>
+              <w:right w:type="dxa" w:w="120"/>
+            </w:tcMar>
+          </w:tcPr>
+          <w:p>
+            <w:r>
+              <w:rPr>
+                <w:b w:val="false"/>
+                <w:bCs w:val="false"/>
+              </w:rPr>
+              <w:t xml:space="preserve">A la izquierda el nombre, a la derecha un termómetro con su avance (Promesa → adelantos → insignia terminal → ruta de enlace) y una casilla por adelanto: un toque ½ en curso, otro ✓ logrado, otro lo quita. Con el desplegable se cambia a una categoría de especialidades o a las correas.</w:t>
+            </w:r>
+          </w:p>
+        </w:tc>
+      </w:tr>
+      <w:tr>
+        <w:tc>
+          <w:tcPr>
+            <w:tcW w:type="dxa" w:w="2300"/>
+            <w:tcBorders>
+              <w:top w:val="single" w:color="C9CFDF" w:sz="4"/>
+              <w:left w:val="single" w:color="C9CFDF" w:sz="4"/>
+              <w:bottom w:val="single" w:color="C9CFDF" w:sz="4"/>
+              <w:right w:val="single" w:color="C9CFDF" w:sz="4"/>
+            </w:tcBorders>
+            <w:shd w:fill="EEF2F5" w:color="auto" w:val="clear"/>
+            <w:tcMar>
+              <w:top w:type="dxa" w:w="80"/>
+              <w:left w:type="dxa" w:w="120"/>
+              <w:bottom w:type="dxa" w:w="80"/>
+              <w:right w:type="dxa" w:w="120"/>
+            </w:tcMar>
+          </w:tcPr>
+          <w:p>
+            <w:r>
+              <w:rPr>
+                <w:b/>
+                <w:bCs/>
+              </w:rPr>
+              <w:t xml:space="preserve">Adelantos e insignias</w:t>
+            </w:r>
+          </w:p>
+        </w:tc>
+        <w:tc>
+          <w:tcPr>
+            <w:tcW w:type="dxa" w:w="7060"/>
+            <w:tcBorders>
+              <w:top w:val="single" w:color="C9CFDF" w:sz="4"/>
+              <w:left w:val="single" w:color="C9CFDF" w:sz="4"/>
+              <w:bottom w:val="single" w:color="C9CFDF" w:sz="4"/>
+              <w:right w:val="single" w:color="C9CFDF" w:sz="4"/>
+            </w:tcBorders>
+            <w:shd w:fill="EEF2F5" w:color="auto" w:val="clear"/>
+            <w:tcMar>
+              <w:top w:type="dxa" w:w="80"/>
+              <w:left w:type="dxa" w:w="120"/>
+              <w:bottom w:type="dxa" w:w="80"/>
+              <w:right w:type="dxa" w:w="120"/>
+            </w:tcMar>
+          </w:tcPr>
+          <w:p>
+            <w:r>
+              <w:rPr>
+                <w:b w:val="false"/>
+                <w:bCs w:val="false"/>
+              </w:rPr>
+              <w:t xml:space="preserve">Primero eliges "Adelantos" o una categoría de especialidades (Deportes, Ecología, Correas…) y luego la insignia: así la lista no es tan larga. Se ven los requisitos.</w:t>
+            </w:r>
+          </w:p>
+        </w:tc>
+      </w:tr>
+      <w:tr>
+        <w:tc>
+          <w:tcPr>
+            <w:tcW w:type="dxa" w:w="2300"/>
+            <w:tcBorders>
+              <w:top w:val="single" w:color="C9CFDF" w:sz="4"/>
+              <w:left w:val="single" w:color="C9CFDF" w:sz="4"/>
+              <w:bottom w:val="single" w:color="C9CFDF" w:sz="4"/>
+              <w:right w:val="single" w:color="C9CFDF" w:sz="4"/>
+            </w:tcBorders>
+            <w:shd w:fill="FFFFFF" w:color="auto" w:val="clear"/>
+            <w:tcMar>
+              <w:top w:type="dxa" w:w="80"/>
+              <w:left w:type="dxa" w:w="120"/>
+              <w:bottom w:type="dxa" w:w="80"/>
+              <w:right w:type="dxa" w:w="120"/>
+            </w:tcMar>
+          </w:tcPr>
+          <w:p>
+            <w:r>
+              <w:rPr>
+                <w:b/>
+                <w:bCs/>
+              </w:rPr>
+              <w:t xml:space="preserve">Avisos por edad</w:t>
+            </w:r>
+          </w:p>
+        </w:tc>
+        <w:tc>
+          <w:tcPr>
+            <w:tcW w:type="dxa" w:w="7060"/>
+            <w:tcBorders>
+              <w:top w:val="single" w:color="C9CFDF" w:sz="4"/>
+              <w:left w:val="single" w:color="C9CFDF" w:sz="4"/>
+              <w:bottom w:val="single" w:color="C9CFDF" w:sz="4"/>
+              <w:right w:val="single" w:color="C9CFDF" w:sz="4"/>
+            </w:tcBorders>
+            <w:shd w:fill="FFFFFF" w:color="auto" w:val="clear"/>
+            <w:tcMar>
+              <w:top w:type="dxa" w:w="80"/>
+              <w:left w:type="dxa" w:w="120"/>
+              <w:bottom w:type="dxa" w:w="80"/>
+              <w:right w:type="dxa" w:w="120"/>
+            </w:tcMar>
+          </w:tcPr>
+          <w:p>
+            <w:r>
+              <w:rPr>
+                <w:b w:val="false"/>
+                <w:bCs w:val="false"/>
+              </w:rPr>
+              <w:t xml:space="preserve">Cada miembro se compara con la edad de su sección: "iniciar ruta de enlace" cuando cumple la edad de paso en los próximos meses y "ya le toca pasar" cuando ya la cumplió.</w:t>
+            </w:r>
+          </w:p>
+        </w:tc>
+      </w:tr>
+      <w:tr>
+        <w:tc>
+          <w:tcPr>
+            <w:tcW w:type="dxa" w:w="2300"/>
+            <w:tcBorders>
+              <w:top w:val="single" w:color="C9CFDF" w:sz="4"/>
+              <w:left w:val="single" w:color="C9CFDF" w:sz="4"/>
+              <w:bottom w:val="single" w:color="C9CFDF" w:sz="4"/>
+              <w:right w:val="single" w:color="C9CFDF" w:sz="4"/>
+            </w:tcBorders>
+            <w:shd w:fill="EEF2F5" w:color="auto" w:val="clear"/>
+            <w:tcMar>
+              <w:top w:type="dxa" w:w="80"/>
+              <w:left w:type="dxa" w:w="120"/>
+              <w:bottom w:type="dxa" w:w="80"/>
+              <w:right w:type="dxa" w:w="120"/>
+            </w:tcMar>
+          </w:tcPr>
+          <w:p>
+            <w:r>
+              <w:rPr>
+                <w:b/>
+                <w:bCs/>
+              </w:rPr>
+              <w:t xml:space="preserve">Credencial electrónica</w:t>
+            </w:r>
+          </w:p>
+        </w:tc>
+        <w:tc>
+          <w:tcPr>
+            <w:tcW w:type="dxa" w:w="7060"/>
+            <w:tcBorders>
+              <w:top w:val="single" w:color="C9CFDF" w:sz="4"/>
+              <w:left w:val="single" w:color="C9CFDF" w:sz="4"/>
+              <w:bottom w:val="single" w:color="C9CFDF" w:sz="4"/>
+              <w:right w:val="single" w:color="C9CFDF" w:sz="4"/>
+            </w:tcBorders>
+            <w:shd w:fill="EEF2F5" w:color="auto" w:val="clear"/>
+            <w:tcMar>
+              <w:top w:type="dxa" w:w="80"/>
+              <w:left w:type="dxa" w:w="120"/>
+              <w:bottom w:type="dxa" w:w="80"/>
+              <w:right w:type="dxa" w:w="120"/>
+            </w:tcMar>
+          </w:tcPr>
+          <w:p>
+            <w:r>
+              <w:rPr>
+                <w:b w:val="false"/>
+                <w:bCs w:val="false"/>
+              </w:rPr>
+              <w:t xml:space="preserve">Desde la ficha del miembro: foto, nombre, sección, equipo, folio, ciclo y un QR que confirma si su registro está vigente. Se descarga en PDF (frente y reverso con datos de emergencia) o se envía a la familia por WhatsApp.</w:t>
+            </w:r>
+          </w:p>
+        </w:tc>
+      </w:tr>
+      <w:tr>
+        <w:tc>
+          <w:tcPr>
+            <w:tcW w:type="dxa" w:w="2300"/>
+            <w:tcBorders>
+              <w:top w:val="single" w:color="C9CFDF" w:sz="4"/>
+              <w:left w:val="single" w:color="C9CFDF" w:sz="4"/>
+              <w:bottom w:val="single" w:color="C9CFDF" w:sz="4"/>
+              <w:right w:val="single" w:color="C9CFDF" w:sz="4"/>
+            </w:tcBorders>
+            <w:shd w:fill="FFFFFF" w:color="auto" w:val="clear"/>
+            <w:tcMar>
+              <w:top w:type="dxa" w:w="80"/>
+              <w:left w:type="dxa" w:w="120"/>
+              <w:bottom w:type="dxa" w:w="80"/>
+              <w:right w:type="dxa" w:w="120"/>
+            </w:tcMar>
+          </w:tcPr>
+          <w:p>
+            <w:r>
+              <w:rPr>
+                <w:b/>
+                <w:bCs/>
+              </w:rPr>
+              <w:t xml:space="preserve">Calendario del grupo</w:t>
+            </w:r>
+          </w:p>
+        </w:tc>
+        <w:tc>
+          <w:tcPr>
+            <w:tcW w:type="dxa" w:w="7060"/>
+            <w:tcBorders>
+              <w:top w:val="single" w:color="C9CFDF" w:sz="4"/>
+              <w:left w:val="single" w:color="C9CFDF" w:sz="4"/>
+              <w:bottom w:val="single" w:color="C9CFDF" w:sz="4"/>
+              <w:right w:val="single" w:color="C9CFDF" w:sz="4"/>
+            </w:tcBorders>
+            <w:shd w:fill="FFFFFF" w:color="auto" w:val="clear"/>
+            <w:tcMar>
+              <w:top w:type="dxa" w:w="80"/>
+              <w:left w:type="dxa" w:w="120"/>
+              <w:bottom w:type="dxa" w:w="80"/>
+              <w:right w:type="dxa" w:w="120"/>
+            </w:tcMar>
+          </w:tcPr>
+          <w:p>
+            <w:r>
+              <w:rPr>
+                <w:b w:val="false"/>
+                <w:bCs w:val="false"/>
+              </w:rPr>
+              <w:t xml:space="preserve">Todas las secciones en un mes: rojo = todo el grupo, amarillo = salida de sección, verde = ordinaria; la orilla de cada actividad lleva el color de su sección.</w:t>
+            </w:r>
+          </w:p>
+        </w:tc>
+      </w:tr>
+    </w:tbl>
+    <w:p>
+      <w:pPr>
+        <w:spacing w:after="120"/>
+      </w:pPr>
+    </w:p>
+    <w:p>
+      <w:pPr>
+        <w:spacing w:after="60" w:before="120"/>
+        <w:jc w:val="center"/>
+      </w:pPr>
+      <w:r>
+        <w:drawing>
+          <wp:inline distT="0" distB="0" distL="0" distR="0">
+            <wp:extent cx="5715000" cy="2400300"/>
+            <wp:effectExtent t="0" r="0" b="0" l="0"/>
+            <wp:docPr id="1" name="20_dirigentes_v4.jpg" descr="Patrullas y cargos, cuadro de logros, credencial y calendario del grupo" title="Patrullas y cargos, cuadro de logros, credencial y calendario del grupo"/>
+            <wp:cNvGraphicFramePr>
+              <a:graphicFrameLocks xmlns:a="http://schemas.openxmlformats.org/drawingml/2006/main" noChangeAspect="1"/>
+            </wp:cNvGraphicFramePr>
+            <a:graphic xmlns:a="http://schemas.openxmlformats.org/drawingml/2006/main">
+              <a:graphicData uri="http://schemas.openxmlformats.org/drawingml/2006/picture">
+                <pic:pic xmlns:pic="http://schemas.openxmlformats.org/drawingml/2006/picture">
+                  <pic:nvPicPr>
+                    <pic:cNvPr id="0" name="" descr=""/>
+                    <pic:cNvPicPr>
+                      <a:picLocks noChangeAspect="1" noChangeArrowheads="1"/>
+                    </pic:cNvPicPr>
+                  </pic:nvPicPr>
+                  <pic:blipFill>
+                    <a:blip r:embed="rId31" cstate="none"/>
+                    <a:srcRect/>
+                    <a:stretch>
+                      <a:fillRect/>
+                    </a:stretch>
+                  </pic:blipFill>
+                  <pic:spPr bwMode="auto">
+                    <a:xfrm>
+                      <a:off x="0" y="0"/>
+                      <a:ext cx="5715000" cy="2400300"/>
+                    </a:xfrm>
+                    <a:prstGeom prst="rect">
+                      <a:avLst/>
+                    </a:prstGeom>
+                  </pic:spPr>
+                </pic:pic>
+              </a:graphicData>
+            </a:graphic>
+          </wp:inline>
+        </w:drawing>
+      </w:r>
+    </w:p>
+    <w:p>
+      <w:pPr>
+        <w:spacing w:after="200"/>
+        <w:jc w:val="center"/>
+      </w:pPr>
+      <w:r>
+        <w:rPr>
+          <w:i/>
+          <w:iCs/>
+          <w:color w:val="666666"/>
+          <w:sz w:val="18"/>
+          <w:szCs w:val="18"/>
+        </w:rPr>
+        <w:t xml:space="preserve">Patrullas y cargos, cuadro de logros, credencial y calendario del grupo</w:t>
+      </w:r>
+    </w:p>
+    <w:p>
+      <w:pPr>
+        <w:pStyle w:val="Heading2"/>
+      </w:pPr>
+      <w:r>
+        <w:t xml:space="preserve">Nuevo ingreso: foto, ficha con firma y liga de pago</w:t>
+      </w:r>
+    </w:p>
+    <w:p>
+      <w:pPr>
+        <w:pStyle w:val="ListParagraph"/>
+        <w:numPr>
+          <w:ilvl w:val="0"/>
+          <w:numId w:val="14"/>
+        </w:numPr>
+        <w:spacing w:after="80" w:line="290"/>
+      </w:pPr>
+      <w:r>
+        <w:rPr>
+          <w:b/>
+          <w:bCs/>
+        </w:rPr>
+        <w:t xml:space="preserve">Inicio → "Nuevo ingreso". </w:t>
+      </w:r>
+      <w:r>
+        <w:t xml:space="preserve">Toma la foto con la cámara del celular, escribe nombre, fecha de nacimiento y los datos del tutor. Queda "en prueba" y aparece en el pase de lista.</w:t>
+      </w:r>
+    </w:p>
+    <w:p>
+      <w:pPr>
+        <w:pStyle w:val="ListParagraph"/>
+        <w:numPr>
+          <w:ilvl w:val="0"/>
+          <w:numId w:val="14"/>
+        </w:numPr>
+        <w:spacing w:after="80" w:line="290"/>
+      </w:pPr>
+      <w:r>
+        <w:rPr>
+          <w:b/>
+          <w:bCs/>
+        </w:rPr>
+        <w:t xml:space="preserve">"Guardar y llenar ficha, firma y pago". </w:t>
+      </w:r>
+      <w:r>
+        <w:t xml:space="preserve">El tutor marca las autorizaciones y firma con el dedo en la pantalla.</w:t>
+      </w:r>
+    </w:p>
+    <w:p>
+      <w:pPr>
+        <w:pStyle w:val="ListParagraph"/>
+        <w:numPr>
+          <w:ilvl w:val="0"/>
+          <w:numId w:val="14"/>
+        </w:numPr>
+        <w:spacing w:after="80" w:line="290"/>
+      </w:pPr>
+      <w:r>
+        <w:rPr>
+          <w:b/>
+          <w:bCs/>
+        </w:rPr>
+        <w:t xml:space="preserve">Liga de pago. </w:t>
+      </w:r>
+      <w:r>
+        <w:t xml:space="preserve">Se genera el cargo de registro con su QR y el botón "Enviar liga por WhatsApp". El tutor paga con tarjeta, OXXO o Mercado Pago; si paga en efectivo se entrega a tesorería.</w:t>
+      </w:r>
+    </w:p>
+    <w:p>
+      <w:pPr>
+        <w:pStyle w:val="ListParagraph"/>
+        <w:numPr>
+          <w:ilvl w:val="0"/>
+          <w:numId w:val="14"/>
+        </w:numPr>
+        <w:spacing w:after="80" w:line="290"/>
+      </w:pPr>
+      <w:r>
+        <w:t xml:space="preserve">Secretaría revisa la ficha y el jefe de grupo la valida, como siempre.</w:t>
+      </w:r>
+    </w:p>
+    <w:p>
+      <w:pPr>
+        <w:pBdr>
+          <w:left w:val="single" w:color="F36F45" w:sz="24" w:space="8"/>
+        </w:pBdr>
+        <w:shd w:fill="FDF0EA" w:color="auto" w:val="clear"/>
+        <w:spacing w:after="160" w:before="120" w:line="290"/>
+      </w:pPr>
+      <w:r>
+        <w:rPr>
+          <w:b/>
+          <w:bCs/>
+          <w:color w:val="0F3049"/>
+        </w:rPr>
+        <w:t xml:space="preserve">2 asistencias: </w:t>
+      </w:r>
+      <w:r>
+        <w:t xml:space="preserve">Un nuevo ingreso puede seguir asistiendo, pero en el pase de lista se ve su cuenta ("1.ª asist. · nuevo", "2.ª asist. · debe registrarse"). Al cerrar la lista donde llega a 2 asistencias sin registro pagado, el sistema avisa una sola vez a los jefes de su sección y a tesorería (mensaje y tarea "Cobrar registro de nuevo ingreso").</w:t>
+      </w:r>
+    </w:p>
+    <w:p>
+      <w:pPr>
+        <w:spacing w:after="60" w:before="120"/>
+        <w:jc w:val="center"/>
+      </w:pPr>
+      <w:r>
+        <w:drawing>
+          <wp:inline distT="0" distB="0" distL="0" distR="0">
+            <wp:extent cx="5715000" cy="2238375"/>
+            <wp:effectExtent t="0" r="0" b="0" l="0"/>
+            <wp:docPr id="1" name="21_nuevo_ingreso.jpg" descr="Nuevo ingreso, firma del tutor, liga de pago y programa enviado al consejo" title="Nuevo ingreso, firma del tutor, liga de pago y programa enviado al consejo"/>
+            <wp:cNvGraphicFramePr>
+              <a:graphicFrameLocks xmlns:a="http://schemas.openxmlformats.org/drawingml/2006/main" noChangeAspect="1"/>
+            </wp:cNvGraphicFramePr>
+            <a:graphic xmlns:a="http://schemas.openxmlformats.org/drawingml/2006/main">
+              <a:graphicData uri="http://schemas.openxmlformats.org/drawingml/2006/picture">
+                <pic:pic xmlns:pic="http://schemas.openxmlformats.org/drawingml/2006/picture">
+                  <pic:nvPicPr>
+                    <pic:cNvPr id="0" name="" descr=""/>
+                    <pic:cNvPicPr>
+                      <a:picLocks noChangeAspect="1" noChangeArrowheads="1"/>
+                    </pic:cNvPicPr>
+                  </pic:nvPicPr>
+                  <pic:blipFill>
+                    <a:blip r:embed="rId32" cstate="none"/>
+                    <a:srcRect/>
+                    <a:stretch>
+                      <a:fillRect/>
+                    </a:stretch>
+                  </pic:blipFill>
+                  <pic:spPr bwMode="auto">
+                    <a:xfrm>
+                      <a:off x="0" y="0"/>
+                      <a:ext cx="5715000" cy="2238375"/>
+                    </a:xfrm>
+                    <a:prstGeom prst="rect">
+                      <a:avLst/>
+                    </a:prstGeom>
+                  </pic:spPr>
+                </pic:pic>
+              </a:graphicData>
+            </a:graphic>
+          </wp:inline>
+        </w:drawing>
+      </w:r>
+    </w:p>
+    <w:p>
+      <w:pPr>
+        <w:spacing w:after="200"/>
+        <w:jc w:val="center"/>
+      </w:pPr>
+      <w:r>
+        <w:rPr>
+          <w:i/>
+          <w:iCs/>
+          <w:color w:val="666666"/>
+          <w:sz w:val="18"/>
+          <w:szCs w:val="18"/>
+        </w:rPr>
+        <w:t xml:space="preserve">Nuevo ingreso, firma del tutor, liga de pago y programa enviado al consejo</w:t>
+      </w:r>
+    </w:p>
+    <w:p>
+      <w:pPr>
+        <w:pStyle w:val="Heading2"/>
+      </w:pPr>
+      <w:r>
+        <w:t xml:space="preserve">Rutas de enlace y permanencia</w:t>
+      </w:r>
+    </w:p>
+    <w:p>
+      <w:pPr>
+        <w:spacing w:after="120" w:line="300"/>
+      </w:pPr>
+      <w:r>
+        <w:t xml:space="preserve">Cada beneficiario tiene un contador permanente del tiempo que le queda en su sección (años, meses y días), calculado con su fecha de nacimiento y las edades oficiales del grupo. Se ve en la lista de miembros, en su ficha, en el portal y en Odoo.</w:t>
+      </w:r>
+    </w:p>
+    <w:tbl>
+      <w:tblPr>
+        <w:tblW w:type="dxa" w:w="9360"/>
+        <w:tblBorders>
+          <w:top w:val="single" w:color="auto" w:sz="4"/>
+          <w:left w:val="single" w:color="auto" w:sz="4"/>
+          <w:bottom w:val="single" w:color="auto" w:sz="4"/>
+          <w:right w:val="single" w:color="auto" w:sz="4"/>
+          <w:insideH w:val="single" w:color="auto" w:sz="4"/>
+          <w:insideV w:val="single" w:color="auto" w:sz="4"/>
+        </w:tblBorders>
+      </w:tblPr>
+      <w:tblGrid>
+        <w:gridCol w:w="2300"/>
+        <w:gridCol w:w="2000"/>
+        <w:gridCol w:w="2300"/>
+        <w:gridCol w:w="2760"/>
+      </w:tblGrid>
+      <w:tr>
+        <w:trPr>
+          <w:tblHeader/>
+        </w:trPr>
+        <w:tc>
+          <w:tcPr>
+            <w:tcW w:type="dxa" w:w="2300"/>
+            <w:tcBorders>
+              <w:top w:val="single" w:color="C9CFDF" w:sz="4"/>
+              <w:left w:val="single" w:color="C9CFDF" w:sz="4"/>
+              <w:bottom w:val="single" w:color="C9CFDF" w:sz="4"/>
+              <w:right w:val="single" w:color="C9CFDF" w:sz="4"/>
+            </w:tcBorders>
+            <w:shd w:fill="0F3049" w:color="auto" w:val="clear"/>
+            <w:tcMar>
+              <w:top w:type="dxa" w:w="80"/>
+              <w:left w:type="dxa" w:w="120"/>
+              <w:bottom w:type="dxa" w:w="80"/>
+              <w:right w:type="dxa" w:w="120"/>
+            </w:tcMar>
+          </w:tcPr>
+          <w:p>
+            <w:r>
+              <w:rPr>
+                <w:b/>
+                <w:bCs/>
+                <w:color w:val="FFFFFF"/>
+              </w:rPr>
+              <w:t xml:space="preserve">Sección</w:t>
+            </w:r>
+          </w:p>
+        </w:tc>
+        <w:tc>
+          <w:tcPr>
+            <w:tcW w:type="dxa" w:w="2000"/>
+            <w:tcBorders>
+              <w:top w:val="single" w:color="C9CFDF" w:sz="4"/>
+              <w:left w:val="single" w:color="C9CFDF" w:sz="4"/>
+              <w:bottom w:val="single" w:color="C9CFDF" w:sz="4"/>
+              <w:right w:val="single" w:color="C9CFDF" w:sz="4"/>
+            </w:tcBorders>
+            <w:shd w:fill="0F3049" w:color="auto" w:val="clear"/>
+            <w:tcMar>
+              <w:top w:type="dxa" w:w="80"/>
+              <w:left w:type="dxa" w:w="120"/>
+              <w:bottom w:type="dxa" w:w="80"/>
+              <w:right w:type="dxa" w:w="120"/>
+            </w:tcMar>
+          </w:tcPr>
+          <w:p>
+            <w:r>
+              <w:rPr>
+                <w:b/>
+                <w:bCs/>
+                <w:color w:val="FFFFFF"/>
+              </w:rPr>
+              <w:t xml:space="preserve">Inicio de ruta</w:t>
+            </w:r>
+          </w:p>
+        </w:tc>
+        <w:tc>
+          <w:tcPr>
+            <w:tcW w:type="dxa" w:w="2300"/>
+            <w:tcBorders>
+              <w:top w:val="single" w:color="C9CFDF" w:sz="4"/>
+              <w:left w:val="single" w:color="C9CFDF" w:sz="4"/>
+              <w:bottom w:val="single" w:color="C9CFDF" w:sz="4"/>
+              <w:right w:val="single" w:color="C9CFDF" w:sz="4"/>
+            </w:tcBorders>
+            <w:shd w:fill="0F3049" w:color="auto" w:val="clear"/>
+            <w:tcMar>
+              <w:top w:type="dxa" w:w="80"/>
+              <w:left w:type="dxa" w:w="120"/>
+              <w:bottom w:type="dxa" w:w="80"/>
+              <w:right w:type="dxa" w:w="120"/>
+            </w:tcMar>
+          </w:tcPr>
+          <w:p>
+            <w:r>
+              <w:rPr>
+                <w:b/>
+                <w:bCs/>
+                <w:color w:val="FFFFFF"/>
+              </w:rPr>
+              <w:t xml:space="preserve">Pase oficial</w:t>
+            </w:r>
+          </w:p>
+        </w:tc>
+        <w:tc>
+          <w:tcPr>
+            <w:tcW w:type="dxa" w:w="2760"/>
+            <w:tcBorders>
+              <w:top w:val="single" w:color="C9CFDF" w:sz="4"/>
+              <w:left w:val="single" w:color="C9CFDF" w:sz="4"/>
+              <w:bottom w:val="single" w:color="C9CFDF" w:sz="4"/>
+              <w:right w:val="single" w:color="C9CFDF" w:sz="4"/>
+            </w:tcBorders>
+            <w:shd w:fill="0F3049" w:color="auto" w:val="clear"/>
+            <w:tcMar>
+              <w:top w:type="dxa" w:w="80"/>
+              <w:left w:type="dxa" w:w="120"/>
+              <w:bottom w:type="dxa" w:w="80"/>
+              <w:right w:type="dxa" w:w="120"/>
+            </w:tcMar>
+          </w:tcPr>
+          <w:p>
+            <w:r>
+              <w:rPr>
+                <w:b/>
+                <w:bCs/>
+                <w:color w:val="FFFFFF"/>
+              </w:rPr>
+              <w:t xml:space="preserve">Destino</w:t>
+            </w:r>
+          </w:p>
+        </w:tc>
+      </w:tr>
+      <w:tr>
+        <w:tc>
+          <w:tcPr>
+            <w:tcW w:type="dxa" w:w="2300"/>
+            <w:tcBorders>
+              <w:top w:val="single" w:color="C9CFDF" w:sz="4"/>
+              <w:left w:val="single" w:color="C9CFDF" w:sz="4"/>
+              <w:bottom w:val="single" w:color="C9CFDF" w:sz="4"/>
+              <w:right w:val="single" w:color="C9CFDF" w:sz="4"/>
+            </w:tcBorders>
+            <w:shd w:fill="FFFFFF" w:color="auto" w:val="clear"/>
+            <w:tcMar>
+              <w:top w:type="dxa" w:w="80"/>
+              <w:left w:type="dxa" w:w="120"/>
+              <w:bottom w:type="dxa" w:w="80"/>
+              <w:right w:type="dxa" w:w="120"/>
+            </w:tcMar>
+          </w:tcPr>
+          <w:p>
+            <w:r>
+              <w:rPr>
+                <w:b/>
+                <w:bCs/>
+              </w:rPr>
+              <w:t xml:space="preserve">Castores</w:t>
+            </w:r>
+          </w:p>
+        </w:tc>
+        <w:tc>
+          <w:tcPr>
+            <w:tcW w:type="dxa" w:w="2000"/>
+            <w:tcBorders>
+              <w:top w:val="single" w:color="C9CFDF" w:sz="4"/>
+              <w:left w:val="single" w:color="C9CFDF" w:sz="4"/>
+              <w:bottom w:val="single" w:color="C9CFDF" w:sz="4"/>
+              <w:right w:val="single" w:color="C9CFDF" w:sz="4"/>
+            </w:tcBorders>
+            <w:shd w:fill="FFFFFF" w:color="auto" w:val="clear"/>
+            <w:tcMar>
+              <w:top w:type="dxa" w:w="80"/>
+              <w:left w:type="dxa" w:w="120"/>
+              <w:bottom w:type="dxa" w:w="80"/>
+              <w:right w:type="dxa" w:w="120"/>
+            </w:tcMar>
+          </w:tcPr>
+          <w:p>
+            <w:r>
+              <w:rPr>
+                <w:b w:val="false"/>
+                <w:bCs w:val="false"/>
+              </w:rPr>
+              <w:t xml:space="preserve">5 años 6 meses</w:t>
+            </w:r>
+          </w:p>
+        </w:tc>
+        <w:tc>
+          <w:tcPr>
+            <w:tcW w:type="dxa" w:w="2300"/>
+            <w:tcBorders>
+              <w:top w:val="single" w:color="C9CFDF" w:sz="4"/>
+              <w:left w:val="single" w:color="C9CFDF" w:sz="4"/>
+              <w:bottom w:val="single" w:color="C9CFDF" w:sz="4"/>
+              <w:right w:val="single" w:color="C9CFDF" w:sz="4"/>
+            </w:tcBorders>
+            <w:shd w:fill="FFFFFF" w:color="auto" w:val="clear"/>
+            <w:tcMar>
+              <w:top w:type="dxa" w:w="80"/>
+              <w:left w:type="dxa" w:w="120"/>
+              <w:bottom w:type="dxa" w:w="80"/>
+              <w:right w:type="dxa" w:w="120"/>
+            </w:tcMar>
+          </w:tcPr>
+          <w:p>
+            <w:r>
+              <w:rPr>
+                <w:b w:val="false"/>
+                <w:bCs w:val="false"/>
+              </w:rPr>
+              <w:t xml:space="preserve">6 años</w:t>
+            </w:r>
+          </w:p>
+        </w:tc>
+        <w:tc>
+          <w:tcPr>
+            <w:tcW w:type="dxa" w:w="2760"/>
+            <w:tcBorders>
+              <w:top w:val="single" w:color="C9CFDF" w:sz="4"/>
+              <w:left w:val="single" w:color="C9CFDF" w:sz="4"/>
+              <w:bottom w:val="single" w:color="C9CFDF" w:sz="4"/>
+              <w:right w:val="single" w:color="C9CFDF" w:sz="4"/>
+            </w:tcBorders>
+            <w:shd w:fill="FFFFFF" w:color="auto" w:val="clear"/>
+            <w:tcMar>
+              <w:top w:type="dxa" w:w="80"/>
+              <w:left w:type="dxa" w:w="120"/>
+              <w:bottom w:type="dxa" w:w="80"/>
+              <w:right w:type="dxa" w:w="120"/>
+            </w:tcMar>
+          </w:tcPr>
+          <w:p>
+            <w:r>
+              <w:rPr>
+                <w:b w:val="false"/>
+                <w:bCs w:val="false"/>
+              </w:rPr>
+              <w:t xml:space="preserve">Lobatos (niños) o Gacelas (niñas)</w:t>
+            </w:r>
+          </w:p>
+        </w:tc>
+      </w:tr>
+      <w:tr>
+        <w:tc>
+          <w:tcPr>
+            <w:tcW w:type="dxa" w:w="2300"/>
+            <w:tcBorders>
+              <w:top w:val="single" w:color="C9CFDF" w:sz="4"/>
+              <w:left w:val="single" w:color="C9CFDF" w:sz="4"/>
+              <w:bottom w:val="single" w:color="C9CFDF" w:sz="4"/>
+              <w:right w:val="single" w:color="C9CFDF" w:sz="4"/>
+            </w:tcBorders>
+            <w:shd w:fill="EEF2F5" w:color="auto" w:val="clear"/>
+            <w:tcMar>
+              <w:top w:type="dxa" w:w="80"/>
+              <w:left w:type="dxa" w:w="120"/>
+              <w:bottom w:type="dxa" w:w="80"/>
+              <w:right w:type="dxa" w:w="120"/>
+            </w:tcMar>
+          </w:tcPr>
+          <w:p>
+            <w:r>
+              <w:rPr>
+                <w:b/>
+                <w:bCs/>
+              </w:rPr>
+              <w:t xml:space="preserve">Lobatos / Gacelas</w:t>
+            </w:r>
+          </w:p>
+        </w:tc>
+        <w:tc>
+          <w:tcPr>
+            <w:tcW w:type="dxa" w:w="2000"/>
+            <w:tcBorders>
+              <w:top w:val="single" w:color="C9CFDF" w:sz="4"/>
+              <w:left w:val="single" w:color="C9CFDF" w:sz="4"/>
+              <w:bottom w:val="single" w:color="C9CFDF" w:sz="4"/>
+              <w:right w:val="single" w:color="C9CFDF" w:sz="4"/>
+            </w:tcBorders>
+            <w:shd w:fill="EEF2F5" w:color="auto" w:val="clear"/>
+            <w:tcMar>
+              <w:top w:type="dxa" w:w="80"/>
+              <w:left w:type="dxa" w:w="120"/>
+              <w:bottom w:type="dxa" w:w="80"/>
+              <w:right w:type="dxa" w:w="120"/>
+            </w:tcMar>
+          </w:tcPr>
+          <w:p>
+            <w:r>
+              <w:rPr>
+                <w:b w:val="false"/>
+                <w:bCs w:val="false"/>
+              </w:rPr>
+              <w:t xml:space="preserve">10 años 6 meses</w:t>
+            </w:r>
+          </w:p>
+        </w:tc>
+        <w:tc>
+          <w:tcPr>
+            <w:tcW w:type="dxa" w:w="2300"/>
+            <w:tcBorders>
+              <w:top w:val="single" w:color="C9CFDF" w:sz="4"/>
+              <w:left w:val="single" w:color="C9CFDF" w:sz="4"/>
+              <w:bottom w:val="single" w:color="C9CFDF" w:sz="4"/>
+              <w:right w:val="single" w:color="C9CFDF" w:sz="4"/>
+            </w:tcBorders>
+            <w:shd w:fill="EEF2F5" w:color="auto" w:val="clear"/>
+            <w:tcMar>
+              <w:top w:type="dxa" w:w="80"/>
+              <w:left w:type="dxa" w:w="120"/>
+              <w:bottom w:type="dxa" w:w="80"/>
+              <w:right w:type="dxa" w:w="120"/>
+            </w:tcMar>
+          </w:tcPr>
+          <w:p>
+            <w:r>
+              <w:rPr>
+                <w:b w:val="false"/>
+                <w:bCs w:val="false"/>
+              </w:rPr>
+              <w:t xml:space="preserve">11 años</w:t>
+            </w:r>
+          </w:p>
+        </w:tc>
+        <w:tc>
+          <w:tcPr>
+            <w:tcW w:type="dxa" w:w="2760"/>
+            <w:tcBorders>
+              <w:top w:val="single" w:color="C9CFDF" w:sz="4"/>
+              <w:left w:val="single" w:color="C9CFDF" w:sz="4"/>
+              <w:bottom w:val="single" w:color="C9CFDF" w:sz="4"/>
+              <w:right w:val="single" w:color="C9CFDF" w:sz="4"/>
+            </w:tcBorders>
+            <w:shd w:fill="EEF2F5" w:color="auto" w:val="clear"/>
+            <w:tcMar>
+              <w:top w:type="dxa" w:w="80"/>
+              <w:left w:type="dxa" w:w="120"/>
+              <w:bottom w:type="dxa" w:w="80"/>
+              <w:right w:type="dxa" w:w="120"/>
+            </w:tcMar>
+          </w:tcPr>
+          <w:p>
+            <w:r>
+              <w:rPr>
+                <w:b w:val="false"/>
+                <w:bCs w:val="false"/>
+              </w:rPr>
+              <w:t xml:space="preserve">Tropa masculina / femenina</w:t>
+            </w:r>
+          </w:p>
+        </w:tc>
+      </w:tr>
+      <w:tr>
+        <w:tc>
+          <w:tcPr>
+            <w:tcW w:type="dxa" w:w="2300"/>
+            <w:tcBorders>
+              <w:top w:val="single" w:color="C9CFDF" w:sz="4"/>
+              <w:left w:val="single" w:color="C9CFDF" w:sz="4"/>
+              <w:bottom w:val="single" w:color="C9CFDF" w:sz="4"/>
+              <w:right w:val="single" w:color="C9CFDF" w:sz="4"/>
+            </w:tcBorders>
+            <w:shd w:fill="FFFFFF" w:color="auto" w:val="clear"/>
+            <w:tcMar>
+              <w:top w:type="dxa" w:w="80"/>
+              <w:left w:type="dxa" w:w="120"/>
+              <w:bottom w:type="dxa" w:w="80"/>
+              <w:right w:type="dxa" w:w="120"/>
+            </w:tcMar>
+          </w:tcPr>
+          <w:p>
+            <w:r>
+              <w:rPr>
+                <w:b/>
+                <w:bCs/>
+              </w:rPr>
+              <w:t xml:space="preserve">Tropas</w:t>
+            </w:r>
+          </w:p>
+        </w:tc>
+        <w:tc>
+          <w:tcPr>
+            <w:tcW w:type="dxa" w:w="2000"/>
+            <w:tcBorders>
+              <w:top w:val="single" w:color="C9CFDF" w:sz="4"/>
+              <w:left w:val="single" w:color="C9CFDF" w:sz="4"/>
+              <w:bottom w:val="single" w:color="C9CFDF" w:sz="4"/>
+              <w:right w:val="single" w:color="C9CFDF" w:sz="4"/>
+            </w:tcBorders>
+            <w:shd w:fill="FFFFFF" w:color="auto" w:val="clear"/>
+            <w:tcMar>
+              <w:top w:type="dxa" w:w="80"/>
+              <w:left w:type="dxa" w:w="120"/>
+              <w:bottom w:type="dxa" w:w="80"/>
+              <w:right w:type="dxa" w:w="120"/>
+            </w:tcMar>
+          </w:tcPr>
+          <w:p>
+            <w:r>
+              <w:rPr>
+                <w:b w:val="false"/>
+                <w:bCs w:val="false"/>
+              </w:rPr>
+              <w:t xml:space="preserve">16 años 6 meses</w:t>
+            </w:r>
+          </w:p>
+        </w:tc>
+        <w:tc>
+          <w:tcPr>
+            <w:tcW w:type="dxa" w:w="2300"/>
+            <w:tcBorders>
+              <w:top w:val="single" w:color="C9CFDF" w:sz="4"/>
+              <w:left w:val="single" w:color="C9CFDF" w:sz="4"/>
+              <w:bottom w:val="single" w:color="C9CFDF" w:sz="4"/>
+              <w:right w:val="single" w:color="C9CFDF" w:sz="4"/>
+            </w:tcBorders>
+            <w:shd w:fill="FFFFFF" w:color="auto" w:val="clear"/>
+            <w:tcMar>
+              <w:top w:type="dxa" w:w="80"/>
+              <w:left w:type="dxa" w:w="120"/>
+              <w:bottom w:type="dxa" w:w="80"/>
+              <w:right w:type="dxa" w:w="120"/>
+            </w:tcMar>
+          </w:tcPr>
+          <w:p>
+            <w:r>
+              <w:rPr>
+                <w:b w:val="false"/>
+                <w:bCs w:val="false"/>
+              </w:rPr>
+              <w:t xml:space="preserve">17 años</w:t>
+            </w:r>
+          </w:p>
+        </w:tc>
+        <w:tc>
+          <w:tcPr>
+            <w:tcW w:type="dxa" w:w="2760"/>
+            <w:tcBorders>
+              <w:top w:val="single" w:color="C9CFDF" w:sz="4"/>
+              <w:left w:val="single" w:color="C9CFDF" w:sz="4"/>
+              <w:bottom w:val="single" w:color="C9CFDF" w:sz="4"/>
+              <w:right w:val="single" w:color="C9CFDF" w:sz="4"/>
+            </w:tcBorders>
+            <w:shd w:fill="FFFFFF" w:color="auto" w:val="clear"/>
+            <w:tcMar>
+              <w:top w:type="dxa" w:w="80"/>
+              <w:left w:type="dxa" w:w="120"/>
+              <w:bottom w:type="dxa" w:w="80"/>
+              <w:right w:type="dxa" w:w="120"/>
+            </w:tcMar>
+          </w:tcPr>
+          <w:p>
+            <w:r>
+              <w:rPr>
+                <w:b w:val="false"/>
+                <w:bCs w:val="false"/>
+              </w:rPr>
+              <w:t xml:space="preserve">Clan Rover / Clan Precursoras</w:t>
+            </w:r>
+          </w:p>
+        </w:tc>
+      </w:tr>
+      <w:tr>
+        <w:tc>
+          <w:tcPr>
+            <w:tcW w:type="dxa" w:w="2300"/>
+            <w:tcBorders>
+              <w:top w:val="single" w:color="C9CFDF" w:sz="4"/>
+              <w:left w:val="single" w:color="C9CFDF" w:sz="4"/>
+              <w:bottom w:val="single" w:color="C9CFDF" w:sz="4"/>
+              <w:right w:val="single" w:color="C9CFDF" w:sz="4"/>
+            </w:tcBorders>
+            <w:shd w:fill="EEF2F5" w:color="auto" w:val="clear"/>
+            <w:tcMar>
+              <w:top w:type="dxa" w:w="80"/>
+              <w:left w:type="dxa" w:w="120"/>
+              <w:bottom w:type="dxa" w:w="80"/>
+              <w:right w:type="dxa" w:w="120"/>
+            </w:tcMar>
+          </w:tcPr>
+          <w:p>
+            <w:r>
+              <w:rPr>
+                <w:b/>
+                <w:bCs/>
+              </w:rPr>
+              <w:t xml:space="preserve">Clan</w:t>
+            </w:r>
+          </w:p>
+        </w:tc>
+        <w:tc>
+          <w:tcPr>
+            <w:tcW w:type="dxa" w:w="2000"/>
+            <w:tcBorders>
+              <w:top w:val="single" w:color="C9CFDF" w:sz="4"/>
+              <w:left w:val="single" w:color="C9CFDF" w:sz="4"/>
+              <w:bottom w:val="single" w:color="C9CFDF" w:sz="4"/>
+              <w:right w:val="single" w:color="C9CFDF" w:sz="4"/>
+            </w:tcBorders>
+            <w:shd w:fill="EEF2F5" w:color="auto" w:val="clear"/>
+            <w:tcMar>
+              <w:top w:type="dxa" w:w="80"/>
+              <w:left w:type="dxa" w:w="120"/>
+              <w:bottom w:type="dxa" w:w="80"/>
+              <w:right w:type="dxa" w:w="120"/>
+            </w:tcMar>
+          </w:tcPr>
+          <w:p>
+            <w:r>
+              <w:rPr>
+                <w:b w:val="false"/>
+                <w:bCs w:val="false"/>
+              </w:rPr>
+              <w:t xml:space="preserve">—</w:t>
+            </w:r>
+          </w:p>
+        </w:tc>
+        <w:tc>
+          <w:tcPr>
+            <w:tcW w:type="dxa" w:w="2300"/>
+            <w:tcBorders>
+              <w:top w:val="single" w:color="C9CFDF" w:sz="4"/>
+              <w:left w:val="single" w:color="C9CFDF" w:sz="4"/>
+              <w:bottom w:val="single" w:color="C9CFDF" w:sz="4"/>
+              <w:right w:val="single" w:color="C9CFDF" w:sz="4"/>
+            </w:tcBorders>
+            <w:shd w:fill="EEF2F5" w:color="auto" w:val="clear"/>
+            <w:tcMar>
+              <w:top w:type="dxa" w:w="80"/>
+              <w:left w:type="dxa" w:w="120"/>
+              <w:bottom w:type="dxa" w:w="80"/>
+              <w:right w:type="dxa" w:w="120"/>
+            </w:tcMar>
+          </w:tcPr>
+          <w:p>
+            <w:r>
+              <w:rPr>
+                <w:b w:val="false"/>
+                <w:bCs w:val="false"/>
+              </w:rPr>
+              <w:t xml:space="preserve">Partida a los 24 años 6 meses</w:t>
+            </w:r>
+          </w:p>
+        </w:tc>
+        <w:tc>
+          <w:tcPr>
+            <w:tcW w:type="dxa" w:w="2760"/>
+            <w:tcBorders>
+              <w:top w:val="single" w:color="C9CFDF" w:sz="4"/>
+              <w:left w:val="single" w:color="C9CFDF" w:sz="4"/>
+              <w:bottom w:val="single" w:color="C9CFDF" w:sz="4"/>
+              <w:right w:val="single" w:color="C9CFDF" w:sz="4"/>
+            </w:tcBorders>
+            <w:shd w:fill="EEF2F5" w:color="auto" w:val="clear"/>
+            <w:tcMar>
+              <w:top w:type="dxa" w:w="80"/>
+              <w:left w:type="dxa" w:w="120"/>
+              <w:bottom w:type="dxa" w:w="80"/>
+              <w:right w:type="dxa" w:w="120"/>
+            </w:tcMar>
+          </w:tcPr>
+          <w:p>
+            <w:r>
+              <w:rPr>
+                <w:b w:val="false"/>
+                <w:bCs w:val="false"/>
+              </w:rPr>
+              <w:t xml:space="preserve">—</w:t>
+            </w:r>
+          </w:p>
+        </w:tc>
+      </w:tr>
+    </w:tbl>
+    <w:p>
+      <w:pPr>
+        <w:spacing w:after="120"/>
+      </w:pPr>
+    </w:p>
+    <w:p>
+      <w:pPr>
+        <w:pStyle w:val="ListParagraph"/>
+        <w:numPr>
+          <w:ilvl w:val="0"/>
+          <w:numId w:val="15"/>
+        </w:numPr>
+        <w:spacing w:after="80" w:line="290"/>
+      </w:pPr>
+      <w:r>
+        <w:rPr>
+          <w:b/>
+          <w:bCs/>
+        </w:rPr>
+        <w:t xml:space="preserve">Amarilla. </w:t>
+      </w:r>
+      <w:r>
+        <w:t xml:space="preserve">Al llegar a la edad de inicio aparece "DEBE INICIAR RUTA DE ENLACE"; cuando el jefe registra el inicio (Portal → Rutas de enlace, o al marcar la Ruta de enlace "en curso" en adelantos) cambia a "EN RUTA DE ENLACE".</w:t>
+      </w:r>
+    </w:p>
+    <w:p>
+      <w:pPr>
+        <w:pStyle w:val="ListParagraph"/>
+        <w:numPr>
+          <w:ilvl w:val="0"/>
+          <w:numId w:val="15"/>
+        </w:numPr>
+        <w:spacing w:after="80" w:line="290"/>
+      </w:pPr>
+      <w:r>
+        <w:rPr>
+          <w:b/>
+          <w:bCs/>
+        </w:rPr>
+        <w:t xml:space="preserve">Roja. </w:t>
+      </w:r>
+      <w:r>
+        <w:t xml:space="preserve">"INICIO DE RUTA VENCIDO" si no se registra el inicio (hay 30 días configurables por sección para capturarlo) y "CAMBIO DE SECCIÓN VENCIDO" al pasar la fecha de pase sin confirmar el cambio. En el Clan: "EDAD MÁXIMA DE PERMANENCIA EN CLAN". La roja no se quita sola: solo con el movimiento registrado o una excepción autorizada.</w:t>
+      </w:r>
+    </w:p>
+    <w:p>
+      <w:pPr>
+        <w:pStyle w:val="ListParagraph"/>
+        <w:numPr>
+          <w:ilvl w:val="0"/>
+          <w:numId w:val="15"/>
+        </w:numPr>
+        <w:spacing w:after="80" w:line="290"/>
+      </w:pPr>
+      <w:r>
+        <w:rPr>
+          <w:b/>
+          <w:bCs/>
+        </w:rPr>
+        <w:t xml:space="preserve">Excepción. </w:t>
+      </w:r>
+      <w:r>
+        <w:t xml:space="preserve">Solo la jefatura de grupo, con motivo, por separado para el inicio y para el pase, y nunca más de 3 meses sobre la fecha oficial. Un inicio tardío no amplía el pase.</w:t>
+      </w:r>
+    </w:p>
+    <w:p>
+      <w:pPr>
+        <w:pStyle w:val="ListParagraph"/>
+        <w:numPr>
+          <w:ilvl w:val="0"/>
+          <w:numId w:val="15"/>
+        </w:numPr>
+        <w:spacing w:after="80" w:line="290"/>
+      </w:pPr>
+      <w:r>
+        <w:rPr>
+          <w:b/>
+          <w:bCs/>
+        </w:rPr>
+        <w:t xml:space="preserve">Cambio de sección. </w:t>
+      </w:r>
+      <w:r>
+        <w:t xml:space="preserve">Nunca ocurre solo por cumplir años: la jefatura de grupo lo confirma ("Confirmar cambio de sección" o "Registrar partida"). El registro queda en el historial y empieza a contar la nueva sección.</w:t>
+      </w:r>
+    </w:p>
+    <w:p>
+      <w:pPr>
+        <w:pBdr>
+          <w:left w:val="single" w:color="F36F45" w:sz="24" w:space="8"/>
+        </w:pBdr>
+        <w:shd w:fill="FDF0EA" w:color="auto" w:val="clear"/>
+        <w:spacing w:after="160" w:before="120" w:line="290"/>
+      </w:pPr>
+      <w:r>
+        <w:rPr>
+          <w:b/>
+          <w:bCs/>
+          <w:color w:val="0F3049"/>
+        </w:rPr>
+        <w:t xml:space="preserve">Avisos: </w:t>
+      </w:r>
+      <w:r>
+        <w:t xml:space="preserve">Un proceso diario revisa a todos. Los jefes de la sección actual y de la receptora reciben aviso al corresponder la ruta, al iniciarla, al acercarse el pase, al autorizarse una excepción, al encenderse una alerta roja y al registrarse el cambio. La jefatura recibe además las rojas. Panel completo: Grupo Scout → Miembros → Control de rutas de enlace y permanencia.</w:t>
+      </w:r>
+    </w:p>
+    <w:p>
+      <w:pPr>
+        <w:pStyle w:val="Heading2"/>
+      </w:pPr>
+      <w:r>
+        <w:t xml:space="preserve">Programa de la sesión por voz</w:t>
+      </w:r>
+    </w:p>
+    <w:p>
+      <w:pPr>
+        <w:spacing w:after="120" w:line="300"/>
+      </w:pPr>
+      <w:r>
+        <w:t xml:space="preserve">Cada sesión tiene su programa con el formato del grupo: hora, etapa, tipo, tiempo, actividad, objetivo, material, responsable, observaciones y las 8 casillas (Programa: estructura, marco simbólico, adelanto progresivo; Método: compromiso o Promesa, pequeños grupos naturales, aprender haciendo, aire libre y adulto estimulante y no interferente).</w:t>
+      </w:r>
+    </w:p>
+    <w:p>
+      <w:pPr>
+        <w:pStyle w:val="ListParagraph"/>
+        <w:numPr>
+          <w:ilvl w:val="0"/>
+          <w:numId w:val="16"/>
+        </w:numPr>
+        <w:spacing w:after="80" w:line="290"/>
+      </w:pPr>
+      <w:r>
+        <w:rPr>
+          <w:b/>
+          <w:bCs/>
+        </w:rPr>
+        <w:t xml:space="preserve">Planear el sábado. </w:t>
+      </w:r>
+      <w:r>
+        <w:t xml:space="preserve">Planificación (trimestral o anual) → toca "Planear" en el sábado (si ya tiene sesión, toca la sesión). Se abre la pantalla "Programa de la sesión".</w:t>
+      </w:r>
+    </w:p>
+    <w:p>
+      <w:pPr>
+        <w:pStyle w:val="ListParagraph"/>
+        <w:numPr>
+          <w:ilvl w:val="0"/>
+          <w:numId w:val="16"/>
+        </w:numPr>
+        <w:spacing w:after="80" w:line="290"/>
+      </w:pPr>
+      <w:r>
+        <w:rPr>
+          <w:b/>
+          <w:bCs/>
+        </w:rPr>
+        <w:t xml:space="preserve">Datos de la sesión. </w:t>
+      </w:r>
+      <w:r>
+        <w:t xml:space="preserve">Arriba, el recuadro "Datos de la sesión" (abierto si aún no tiene mística ni objetivos): nombre, fecha, horario, tipo, clasificación ordinaria o salida, mística, objetivos, lugar y responsables. Toca "Guardar datos de la sesión"; te quedas en la misma pantalla.</w:t>
+      </w:r>
+    </w:p>
+    <w:p>
+      <w:pPr>
+        <w:pStyle w:val="ListParagraph"/>
+        <w:numPr>
+          <w:ilvl w:val="0"/>
+          <w:numId w:val="16"/>
+        </w:numPr>
+        <w:spacing w:after="80" w:line="290"/>
+      </w:pPr>
+      <w:r>
+        <w:rPr>
+          <w:b/>
+          <w:bCs/>
+        </w:rPr>
+        <w:t xml:space="preserve">"Planificar con inteligencia artificial". </w:t>
+      </w:r>
+      <w:r>
+        <w:t xml:space="preserve">Toca el micrófono y dicta de corrido: "A las cuatro honores a la bandera. A las cuatro y cuarto juego por patrullas durante veinte minutos. Después… Finalmente…". Al terminar se interpreta solo (también puedes escribir y tocar "Interpretar").</w:t>
+      </w:r>
+    </w:p>
+    <w:p>
+      <w:pPr>
+        <w:pStyle w:val="ListParagraph"/>
+        <w:numPr>
+          <w:ilvl w:val="0"/>
+          <w:numId w:val="16"/>
+        </w:numPr>
+        <w:spacing w:after="80" w:line="290"/>
+      </w:pPr>
+      <w:r>
+        <w:rPr>
+          <w:b/>
+          <w:bCs/>
+        </w:rPr>
+        <w:t xml:space="preserve">Revisa. </w:t>
+      </w:r>
+      <w:r>
+        <w:t xml:space="preserve">Cada actividad sale con su horario, nombre, descripción y las casillas que el dictado respalda (al tocar una casilla se marca o se quita). Lo que no se dijo queda "por confirmar" y los horarios empalmados se avisan.</w:t>
+      </w:r>
+    </w:p>
+    <w:p>
+      <w:pPr>
+        <w:pStyle w:val="ListParagraph"/>
+        <w:numPr>
+          <w:ilvl w:val="0"/>
+          <w:numId w:val="16"/>
+        </w:numPr>
+        <w:spacing w:after="80" w:line="290"/>
+      </w:pPr>
+      <w:r>
+        <w:rPr>
+          <w:b/>
+          <w:bCs/>
+        </w:rPr>
+        <w:t xml:space="preserve">Corrige por voz o a mano. </w:t>
+      </w:r>
+      <w:r>
+        <w:t xml:space="preserve">"Cambia la de las cuatro y media por una práctica de primeros auxilios y agrega que será mediante equipos", "elimina la de los avisos", "mueve la de las cinco a las cinco y cuarto", "agrega a las cinco y media…".</w:t>
+      </w:r>
+    </w:p>
+    <w:p>
+      <w:pPr>
+        <w:pStyle w:val="ListParagraph"/>
+        <w:numPr>
+          <w:ilvl w:val="0"/>
+          <w:numId w:val="16"/>
+        </w:numPr>
+        <w:spacing w:after="80" w:line="290"/>
+      </w:pPr>
+      <w:r>
+        <w:rPr>
+          <w:b/>
+          <w:bCs/>
+        </w:rPr>
+        <w:t xml:space="preserve">Guarda. </w:t>
+      </w:r>
+      <w:r>
+        <w:t xml:space="preserve">Nada se guarda hasta tocar "Revisé el programa: guardar". Si ya tenía visto bueno, pide confirmar. Se descarga en PDF o en el Excel del grupo.</w:t>
+      </w:r>
+    </w:p>
+    <w:p>
+      <w:pPr>
+        <w:spacing w:after="60" w:before="120"/>
+        <w:jc w:val="center"/>
+      </w:pPr>
+      <w:r>
+        <w:drawing>
+          <wp:inline distT="0" distB="0" distL="0" distR="0">
+            <wp:extent cx="4953000" cy="7734300"/>
+            <wp:effectExtent t="0" r="0" b="0" l="0"/>
+            <wp:docPr id="1" name="23_planear_sabado.jpg" descr="&quot;Planear&quot; el sábado: datos de la sesión y, abajo, el dictado del programa" title="&quot;Planear&quot; el sábado: datos de la sesión y, abajo, el dictado del programa"/>
+            <wp:cNvGraphicFramePr>
+              <a:graphicFrameLocks xmlns:a="http://schemas.openxmlformats.org/drawingml/2006/main" noChangeAspect="1"/>
+            </wp:cNvGraphicFramePr>
+            <a:graphic xmlns:a="http://schemas.openxmlformats.org/drawingml/2006/main">
+              <a:graphicData uri="http://schemas.openxmlformats.org/drawingml/2006/picture">
+                <pic:pic xmlns:pic="http://schemas.openxmlformats.org/drawingml/2006/picture">
+                  <pic:nvPicPr>
+                    <pic:cNvPr id="0" name="" descr=""/>
+                    <pic:cNvPicPr>
+                      <a:picLocks noChangeAspect="1" noChangeArrowheads="1"/>
+                    </pic:cNvPicPr>
+                  </pic:nvPicPr>
+                  <pic:blipFill>
+                    <a:blip r:embed="rId33" cstate="none"/>
+                    <a:srcRect/>
+                    <a:stretch>
+                      <a:fillRect/>
+                    </a:stretch>
+                  </pic:blipFill>
+                  <pic:spPr bwMode="auto">
+                    <a:xfrm>
+                      <a:off x="0" y="0"/>
+                      <a:ext cx="4953000" cy="7734300"/>
+                    </a:xfrm>
+                    <a:prstGeom prst="rect">
+                      <a:avLst/>
+                    </a:prstGeom>
+                  </pic:spPr>
+                </pic:pic>
+              </a:graphicData>
+            </a:graphic>
+          </wp:inline>
+        </w:drawing>
+      </w:r>
+    </w:p>
+    <w:p>
+      <w:pPr>
+        <w:spacing w:after="200"/>
+        <w:jc w:val="center"/>
+      </w:pPr>
+      <w:r>
+        <w:rPr>
+          <w:i/>
+          <w:iCs/>
+          <w:color w:val="666666"/>
+          <w:sz w:val="18"/>
+          <w:szCs w:val="18"/>
+        </w:rPr>
+        <w:t xml:space="preserve">"Planear" el sábado: datos de la sesión y, abajo, el dictado del programa</w:t>
+      </w:r>
+    </w:p>
+    <w:p>
+      <w:pPr>
+        <w:pBdr>
+          <w:left w:val="single" w:color="F36F45" w:sz="24" w:space="8"/>
+        </w:pBdr>
+        <w:shd w:fill="FDF0EA" w:color="auto" w:val="clear"/>
+        <w:spacing w:after="160" w:before="120" w:line="290"/>
+      </w:pPr>
+      <w:r>
+        <w:rPr>
+          <w:b/>
+          <w:bCs/>
+          <w:color w:val="0F3049"/>
+        </w:rPr>
+        <w:t xml:space="preserve">Sin IA externa: </w:t>
+      </w:r>
+      <w:r>
+        <w:t xml:space="preserve">El intérprete funciona con reglas (gratis, sin claves): entiende horas como "a las cuatro y cuarto", "4:30", "de 4 a 4:15", duraciones y "después / al terminar / finalmente". No reescribe ni inventa: la descripción es lo que se dictó, ordenado. Si una casilla no tiene palabras que la respalden, queda sin marcar. El formato tradicional (agregar actividad a mano) sigue disponible.</w:t>
+      </w:r>
+    </w:p>
+    <w:p>
+      <w:pPr>
+        <w:spacing w:after="60" w:before="120"/>
+        <w:jc w:val="center"/>
+      </w:pPr>
+      <w:r>
+        <w:drawing>
+          <wp:inline distT="0" distB="0" distL="0" distR="0">
+            <wp:extent cx="5715000" cy="1962150"/>
+            <wp:effectExtent t="0" r="0" b="0" l="0"/>
+            <wp:docPr id="1" name="22_programa_voz.jpg" descr="Dictado interpretado en el celular y programa en PDF" title="Dictado interpretado en el celular y programa en PDF"/>
+            <wp:cNvGraphicFramePr>
+              <a:graphicFrameLocks xmlns:a="http://schemas.openxmlformats.org/drawingml/2006/main" noChangeAspect="1"/>
+            </wp:cNvGraphicFramePr>
+            <a:graphic xmlns:a="http://schemas.openxmlformats.org/drawingml/2006/main">
+              <a:graphicData uri="http://schemas.openxmlformats.org/drawingml/2006/picture">
+                <pic:pic xmlns:pic="http://schemas.openxmlformats.org/drawingml/2006/picture">
+                  <pic:nvPicPr>
+                    <pic:cNvPr id="0" name="" descr=""/>
+                    <pic:cNvPicPr>
+                      <a:picLocks noChangeAspect="1" noChangeArrowheads="1"/>
+                    </pic:cNvPicPr>
+                  </pic:nvPicPr>
+                  <pic:blipFill>
+                    <a:blip r:embed="rId34" cstate="none"/>
+                    <a:srcRect/>
+                    <a:stretch>
+                      <a:fillRect/>
+                    </a:stretch>
+                  </pic:blipFill>
+                  <pic:spPr bwMode="auto">
+                    <a:xfrm>
+                      <a:off x="0" y="0"/>
+                      <a:ext cx="5715000" cy="1962150"/>
+                    </a:xfrm>
+                    <a:prstGeom prst="rect">
+                      <a:avLst/>
+                    </a:prstGeom>
+                  </pic:spPr>
+                </pic:pic>
+              </a:graphicData>
+            </a:graphic>
+          </wp:inline>
+        </w:drawing>
+      </w:r>
+    </w:p>
+    <w:p>
+      <w:pPr>
+        <w:spacing w:after="200"/>
+        <w:jc w:val="center"/>
+      </w:pPr>
+      <w:r>
+        <w:rPr>
+          <w:i/>
+          <w:iCs/>
+          <w:color w:val="666666"/>
+          <w:sz w:val="18"/>
+          <w:szCs w:val="18"/>
+        </w:rPr>
+        <w:t xml:space="preserve">Dictado interpretado en el celular y programa en PDF</w:t>
+      </w:r>
+    </w:p>
+    <w:p>
+      <w:pPr>
+        <w:pBdr>
+          <w:left w:val="single" w:color="F36F45" w:sz="24" w:space="8"/>
+        </w:pBdr>
+        <w:shd w:fill="FDF0EA" w:color="auto" w:val="clear"/>
+        <w:spacing w:after="160" w:before="120" w:line="290"/>
+      </w:pPr>
+      <w:r>
+        <w:rPr>
+          <w:b/>
+          <w:bCs/>
+          <w:color w:val="0F3049"/>
+        </w:rPr>
+        <w:t xml:space="preserve">Horario de las sesiones nuevas: </w:t>
+      </w:r>
+      <w:r>
+        <w:t xml:space="preserve">Al tocar "Planear" la sesión toma el horario de la última sesión de la sección. Si cambia (por ejemplo de 4 a 6 de la tarde), corrígelo una vez en "Datos de la sesión" y las siguientes lo tomarán.</w:t>
+      </w:r>
+    </w:p>
+    <w:p>
+      <w:pPr>
+        <w:pStyle w:val="Heading2"/>
+      </w:pPr>
+      <w:r>
+        <w:t xml:space="preserve">Programa: consejo y visto bueno del jefe de grupo</w:t>
+      </w:r>
+    </w:p>
+    <w:p>
+      <w:pPr>
+        <w:pStyle w:val="ListParagraph"/>
+        <w:numPr>
+          <w:ilvl w:val="0"/>
+          <w:numId w:val="17"/>
+        </w:numPr>
+        <w:spacing w:after="80" w:line="290"/>
+      </w:pPr>
+      <w:r>
+        <w:rPr>
+          <w:b/>
+          <w:bCs/>
+        </w:rPr>
+        <w:t xml:space="preserve">El jefe de sección planea. </w:t>
+      </w:r>
+      <w:r>
+        <w:t xml:space="preserve">En Planificación usa cada sábado, "Vie–Dom" para anexar un campamento o actividad especial de fin de semana y "Otra fecha" para cualquier otro día. Marca si es ordinaria (verde) o salida (amarilla).</w:t>
+      </w:r>
+    </w:p>
+    <w:p>
+      <w:pPr>
+        <w:pStyle w:val="ListParagraph"/>
+        <w:numPr>
+          <w:ilvl w:val="0"/>
+          <w:numId w:val="17"/>
+        </w:numPr>
+        <w:spacing w:after="80" w:line="290"/>
+      </w:pPr>
+      <w:r>
+        <w:rPr>
+          <w:b/>
+          <w:bCs/>
+        </w:rPr>
+        <w:t xml:space="preserve">"Enviar el programa al consejo". </w:t>
+      </w:r>
+      <w:r>
+        <w:t xml:space="preserve">Las actividades quedan "Enviada al consejo" y la jefatura recibe una tarea.</w:t>
+      </w:r>
+    </w:p>
+    <w:p>
+      <w:pPr>
+        <w:pStyle w:val="ListParagraph"/>
+        <w:numPr>
+          <w:ilvl w:val="0"/>
+          <w:numId w:val="17"/>
+        </w:numPr>
+        <w:spacing w:after="80" w:line="290"/>
+      </w:pPr>
+      <w:r>
+        <w:rPr>
+          <w:b/>
+          <w:bCs/>
+        </w:rPr>
+        <w:t xml:space="preserve">El consejo revisa. </w:t>
+      </w:r>
+      <w:r>
+        <w:t xml:space="preserve">En Odoo: Grupo Scout → Programa → Programa por aprobar (y el Calendario general por colores). Secretaría puede marcar "Revisada en consejo" o "Pedir cambios" con un comentario.</w:t>
+      </w:r>
+    </w:p>
+    <w:p>
+      <w:pPr>
+        <w:pStyle w:val="ListParagraph"/>
+        <w:numPr>
+          <w:ilvl w:val="0"/>
+          <w:numId w:val="17"/>
+        </w:numPr>
+        <w:spacing w:after="80" w:line="290"/>
+      </w:pPr>
+      <w:r>
+        <w:rPr>
+          <w:b/>
+          <w:bCs/>
+        </w:rPr>
+        <w:t xml:space="preserve">Visto bueno. </w:t>
+      </w:r>
+      <w:r>
+        <w:t xml:space="preserve">Las ordinarias (verdes) las aprueba el consejo; las salidas (amarillas) solo el jefe de grupo. Las de todo el grupo (rojas) solo las crea el jefe de grupo y quedan aprobadas.</w:t>
+      </w:r>
+    </w:p>
+    <w:p>
+      <w:pPr>
+        <w:pStyle w:val="ListParagraph"/>
+        <w:numPr>
+          <w:ilvl w:val="0"/>
+          <w:numId w:val="17"/>
+        </w:numPr>
+        <w:spacing w:after="80" w:line="290"/>
+      </w:pPr>
+      <w:r>
+        <w:t xml:space="preserve">Si después se cambia la fecha, el tipo o el lugar, la actividad regresa a revisión.</w:t>
+      </w:r>
+    </w:p>
+    <w:p>
+      <w:pPr>
+        <w:pStyle w:val="ListParagraph"/>
+        <w:numPr>
+          <w:ilvl w:val="0"/>
+          <w:numId w:val="17"/>
+        </w:numPr>
+        <w:spacing w:after="80" w:line="290"/>
+      </w:pPr>
+      <w:r>
+        <w:t xml:space="preserve">El día de la actividad, al pasar lista se ve su mística, objetivos, responsables y si tiene visto bueno.</w:t>
+      </w:r>
+    </w:p>
+    <w:p>
+      <w:pPr>
         <w:pBdr>
           <w:left w:val="single" w:color="F36F45" w:sz="24" w:space="8"/>
         </w:pBdr>
@@ -5329,7 +7148,7 @@
         <w:pStyle w:val="ListParagraph"/>
         <w:numPr>
           <w:ilvl w:val="0"/>
-          <w:numId w:val="14"/>
+          <w:numId w:val="18"/>
         </w:numPr>
         <w:spacing w:after="80" w:line="290"/>
       </w:pPr>
@@ -5342,7 +7161,7 @@
         <w:pStyle w:val="ListParagraph"/>
         <w:numPr>
           <w:ilvl w:val="0"/>
-          <w:numId w:val="14"/>
+          <w:numId w:val="18"/>
         </w:numPr>
         <w:spacing w:after="80" w:line="290"/>
       </w:pPr>
@@ -5355,7 +7174,7 @@
         <w:pStyle w:val="ListParagraph"/>
         <w:numPr>
           <w:ilvl w:val="0"/>
-          <w:numId w:val="14"/>
+          <w:numId w:val="18"/>
         </w:numPr>
         <w:spacing w:after="80" w:line="290"/>
       </w:pPr>
@@ -5368,7 +7187,7 @@
         <w:pStyle w:val="ListParagraph"/>
         <w:numPr>
           <w:ilvl w:val="0"/>
-          <w:numId w:val="14"/>
+          <w:numId w:val="18"/>
         </w:numPr>
         <w:spacing w:after="80" w:line="290"/>
       </w:pPr>
@@ -5381,7 +7200,7 @@
         <w:pStyle w:val="ListParagraph"/>
         <w:numPr>
           <w:ilvl w:val="0"/>
-          <w:numId w:val="14"/>
+          <w:numId w:val="18"/>
         </w:numPr>
         <w:spacing w:after="80" w:line="290"/>
       </w:pPr>
@@ -6575,6 +8394,54 @@
     </w:lvl>
   </w:abstractNum>
   <w:abstractNum w:abstractNumId="14" w15:restartNumberingAfterBreak="0">
+    <w:multiLevelType w:val="hybridMultilevel"/>
+    <w:lvl w:ilvl="0" w15:tentative="1">
+      <w:start w:val="1"/>
+      <w:numFmt w:val="decimal"/>
+      <w:lvlText w:val="%1."/>
+      <w:lvlJc w:val="left"/>
+      <w:pPr>
+        <w:ind w:left="720" w:hanging="360"/>
+      </w:pPr>
+    </w:lvl>
+  </w:abstractNum>
+  <w:abstractNum w:abstractNumId="15" w15:restartNumberingAfterBreak="0">
+    <w:multiLevelType w:val="hybridMultilevel"/>
+    <w:lvl w:ilvl="0" w15:tentative="1">
+      <w:start w:val="1"/>
+      <w:numFmt w:val="decimal"/>
+      <w:lvlText w:val="%1."/>
+      <w:lvlJc w:val="left"/>
+      <w:pPr>
+        <w:ind w:left="720" w:hanging="360"/>
+      </w:pPr>
+    </w:lvl>
+  </w:abstractNum>
+  <w:abstractNum w:abstractNumId="16" w15:restartNumberingAfterBreak="0">
+    <w:multiLevelType w:val="hybridMultilevel"/>
+    <w:lvl w:ilvl="0" w15:tentative="1">
+      <w:start w:val="1"/>
+      <w:numFmt w:val="decimal"/>
+      <w:lvlText w:val="%1."/>
+      <w:lvlJc w:val="left"/>
+      <w:pPr>
+        <w:ind w:left="720" w:hanging="360"/>
+      </w:pPr>
+    </w:lvl>
+  </w:abstractNum>
+  <w:abstractNum w:abstractNumId="17" w15:restartNumberingAfterBreak="0">
+    <w:multiLevelType w:val="hybridMultilevel"/>
+    <w:lvl w:ilvl="0" w15:tentative="1">
+      <w:start w:val="1"/>
+      <w:numFmt w:val="decimal"/>
+      <w:lvlText w:val="%1."/>
+      <w:lvlJc w:val="left"/>
+      <w:pPr>
+        <w:ind w:left="720" w:hanging="360"/>
+      </w:pPr>
+    </w:lvl>
+  </w:abstractNum>
+  <w:abstractNum w:abstractNumId="18" w15:restartNumberingAfterBreak="0">
     <w:multiLevelType w:val="hybridMultilevel"/>
     <w:lvl w:ilvl="0" w15:tentative="1">
       <w:start w:val="1"/>
@@ -6666,6 +8533,30 @@
   </w:num>
   <w:num w:numId="14">
     <w:abstractNumId w:val="14"/>
+    <w:lvlOverride w:ilvl="0">
+      <w:startOverride w:val="1"/>
+    </w:lvlOverride>
+  </w:num>
+  <w:num w:numId="15">
+    <w:abstractNumId w:val="15"/>
+    <w:lvlOverride w:ilvl="0">
+      <w:startOverride w:val="1"/>
+    </w:lvlOverride>
+  </w:num>
+  <w:num w:numId="16">
+    <w:abstractNumId w:val="16"/>
+    <w:lvlOverride w:ilvl="0">
+      <w:startOverride w:val="1"/>
+    </w:lvlOverride>
+  </w:num>
+  <w:num w:numId="17">
+    <w:abstractNumId w:val="17"/>
+    <w:lvlOverride w:ilvl="0">
+      <w:startOverride w:val="1"/>
+    </w:lvlOverride>
+  </w:num>
+  <w:num w:numId="18">
+    <w:abstractNumId w:val="18"/>
     <w:lvlOverride w:ilvl="0">
       <w:startOverride w:val="1"/>
     </w:lvlOverride>

</xml_diff>

<commit_message>
mejoras en la fecha y pago a enviar
</commit_message>
<xml_diff>
--- a/scout_management/doc/Manual_de_uso_Gestion_Grupo_Scout.docx
+++ b/scout_management/doc/Manual_de_uso_Gestion_Grupo_Scout.docx
@@ -103,7 +103,7 @@
           <w:sz w:val="22"/>
           <w:szCs w:val="22"/>
         </w:rPr>
-        <w:t xml:space="preserve">Versión 3.1 · Octubre 2026 · Odoo 19</w:t>
+        <w:t xml:space="preserve">Versión 4.4 · Octubre 2026 · Odoo 19</w:t>
       </w:r>
     </w:p>
     <w:p>
@@ -2858,7 +2858,7 @@
         <w:spacing w:after="80" w:line="290"/>
       </w:pPr>
       <w:r>
-        <w:t xml:space="preserve">Se crea desde el miembro ("Nueva ficha de registro"), en Miembros → Fichas de registro, o el padre la llena y firma desde su portal.</w:t>
+        <w:t xml:space="preserve">Se crea desde el miembro ("Nueva ficha de registro"), en Miembros → Fichas de registro, o la familia la llena y firma desde la liga que le mandas por WhatsApp (sección propuesta por edad y sexo, INE del tutor y forma de pago en línea o efectivo).</w:t>
       </w:r>
     </w:p>
     <w:p>
@@ -2979,7 +2979,7 @@
         <w:t xml:space="preserve">Imprimir: </w:t>
       </w:r>
       <w:r>
-        <w:t xml:space="preserve">El botón "Imprimir ficha" genera el PDF con el formato oficial del grupo, el logo y la flor de lis.</w:t>
+        <w:t xml:space="preserve">El botón "Imprimir ficha" genera el PDF con el formato oficial del grupo: cada dato en su propio renglón, sexo, sección, forma y estado de pago, firmas y la INE como anexo.</w:t>
       </w:r>
     </w:p>
     <w:p>
@@ -5802,7 +5802,7 @@
         <w:t xml:space="preserve">"Guardar y llenar ficha, firma y pago". </w:t>
       </w:r>
       <w:r>
-        <w:t xml:space="preserve">El tutor marca las autorizaciones y firma con el dedo en la pantalla.</w:t>
+        <w:t xml:space="preserve">Se toma la foto de la INE del tutor (frente obligatorio, reverso opcional), el tutor marca todas las autorizaciones (el uso de imagen es obligatorio) y firma con el dedo en la pantalla. La firma debe ser igual a la de su INE.</w:t>
       </w:r>
     </w:p>
     <w:p>
@@ -5836,6 +5836,162 @@
       </w:pPr>
       <w:r>
         <w:t xml:space="preserve">Secretaría revisa la ficha y el jefe de grupo la valida, como siempre.</w:t>
+      </w:r>
+    </w:p>
+    <w:p>
+      <w:pPr>
+        <w:pStyle w:val="Heading2"/>
+      </w:pPr>
+      <w:r>
+        <w:t xml:space="preserve">Renovación de registro y reingreso</w:t>
+      </w:r>
+    </w:p>
+    <w:p>
+      <w:pPr>
+        <w:pStyle w:val="ListParagraph"/>
+        <w:numPr>
+          <w:ilvl w:val="0"/>
+          <w:numId w:val="15"/>
+        </w:numPr>
+        <w:spacing w:after="80" w:line="290"/>
+      </w:pPr>
+      <w:r>
+        <w:rPr>
+          <w:b/>
+          <w:bCs/>
+        </w:rPr>
+        <w:t xml:space="preserve">Renovación. </w:t>
+      </w:r>
+      <w:r>
+        <w:t xml:space="preserve">En la ficha del miembro el botón dice "Renovar registro &lt;ciclo&gt;" cuando ya tuvo ficha en ciclos anteriores y aún no tiene la del ciclo actual. Se llena igual: INE del tutor, autorizaciones, firma y liga de pago.</w:t>
+      </w:r>
+    </w:p>
+    <w:p>
+      <w:pPr>
+        <w:pStyle w:val="ListParagraph"/>
+        <w:numPr>
+          <w:ilvl w:val="0"/>
+          <w:numId w:val="15"/>
+        </w:numPr>
+        <w:spacing w:after="80" w:line="290"/>
+      </w:pPr>
+      <w:r>
+        <w:rPr>
+          <w:b/>
+          <w:bCs/>
+        </w:rPr>
+        <w:t xml:space="preserve">Reingreso. </w:t>
+      </w:r>
+      <w:r>
+        <w:t xml:space="preserve">Miembros → botón ↺ "Reingresos": aparecen las bajas de la sección. "Solicitar reingreso y llenar ficha" crea la solicitud para el jefe de grupo y abre la ficha de reingreso. Al aprobarla, el miembro vuelve a estar activo.</w:t>
+      </w:r>
+    </w:p>
+    <w:p>
+      <w:pPr>
+        <w:pStyle w:val="ListParagraph"/>
+        <w:numPr>
+          <w:ilvl w:val="0"/>
+          <w:numId w:val="15"/>
+        </w:numPr>
+        <w:spacing w:after="80" w:line="290"/>
+      </w:pPr>
+      <w:r>
+        <w:rPr>
+          <w:b/>
+          <w:bCs/>
+        </w:rPr>
+        <w:t xml:space="preserve">En Odoo. </w:t>
+      </w:r>
+      <w:r>
+        <w:t xml:space="preserve">En el contacto: "Renovar registro / nueva ficha" o, si está dado de baja, "Solicitar reingreso". La ficha muestra el tipo (nuevo ingreso, renovación o reingreso) y la INE; el PDF de la ficha incluye la INE como anexo.</w:t>
+      </w:r>
+    </w:p>
+    <w:p>
+      <w:pPr>
+        <w:pStyle w:val="Heading2"/>
+      </w:pPr>
+      <w:r>
+        <w:t xml:space="preserve">Liga para papás: la familia llena la ficha desde su celular</w:t>
+      </w:r>
+    </w:p>
+    <w:p>
+      <w:pPr>
+        <w:pStyle w:val="ListParagraph"/>
+        <w:numPr>
+          <w:ilvl w:val="0"/>
+          <w:numId w:val="16"/>
+        </w:numPr>
+        <w:spacing w:after="80" w:line="290"/>
+      </w:pPr>
+      <w:r>
+        <w:rPr>
+          <w:b/>
+          <w:bCs/>
+        </w:rPr>
+        <w:t xml:space="preserve">Nuevos ingresos. </w:t>
+      </w:r>
+      <w:r>
+        <w:t xml:space="preserve">Portal → Miembros → "Liga para papás" (o en Odoo: Grupo Scout → Miembros → "Liga de inscripción para papás"). Se comparte por WhatsApp, se copia o se muestra el QR. No necesita usuario ni contraseña.</w:t>
+      </w:r>
+    </w:p>
+    <w:p>
+      <w:pPr>
+        <w:pStyle w:val="ListParagraph"/>
+        <w:numPr>
+          <w:ilvl w:val="0"/>
+          <w:numId w:val="16"/>
+        </w:numPr>
+        <w:spacing w:after="80" w:line="290"/>
+      </w:pPr>
+      <w:r>
+        <w:rPr>
+          <w:b/>
+          <w:bCs/>
+        </w:rPr>
+        <w:t xml:space="preserve">Sección automática. </w:t>
+      </w:r>
+      <w:r>
+        <w:t xml:space="preserve">Al escribir la fecha de nacimiento y el sexo, la ficha propone sola la sección que le corresponde según las edades oficiales (por ejemplo 9 años niña → Gacelas, 12 años niño → Tropa masculina). La jefatura puede cambiarla al validar; si el dirigente registra a alguien fuera de su edad, el portal le avisa.</w:t>
+      </w:r>
+    </w:p>
+    <w:p>
+      <w:pPr>
+        <w:pStyle w:val="ListParagraph"/>
+        <w:numPr>
+          <w:ilvl w:val="0"/>
+          <w:numId w:val="16"/>
+        </w:numPr>
+        <w:spacing w:after="80" w:line="290"/>
+      </w:pPr>
+      <w:r>
+        <w:rPr>
+          <w:b/>
+          <w:bCs/>
+        </w:rPr>
+        <w:t xml:space="preserve">Miembros que ya existen. </w:t>
+      </w:r>
+      <w:r>
+        <w:t xml:space="preserve">En la ficha del miembro (portal) o en su contacto en Odoo: "Liga de ficha para la familia". La familia ve los datos ya cargados y solo actualiza, firma y paga.</w:t>
+      </w:r>
+    </w:p>
+    <w:p>
+      <w:pPr>
+        <w:pStyle w:val="ListParagraph"/>
+        <w:numPr>
+          <w:ilvl w:val="0"/>
+          <w:numId w:val="16"/>
+        </w:numPr>
+        <w:spacing w:after="80" w:line="290"/>
+      </w:pPr>
+      <w:r>
+        <w:rPr>
+          <w:b/>
+          <w:bCs/>
+        </w:rPr>
+        <w:t xml:space="preserve">Pago. </w:t>
+      </w:r>
+      <w:r>
+        <w:t xml:space="preserve">Al enviar la ficha, la familia elige: "Pagar en línea" (tarjeta, OXXO o Mercado Pago, igual que en la tienda) o "Pagaré en efectivo en la junta". Con efectivo, tesorería recibe la tarea "Cobrar registro en efectivo"; al recibir el dinero presiona "Registrar pago en efectivo" en la ficha (Odoo) o "Pagará en efectivo" en el portal, y el cargo queda pagado en la Caja.</w:t>
       </w:r>
     </w:p>
     <w:p>
@@ -5852,10 +6008,10 @@
           <w:bCs/>
           <w:color w:val="0F3049"/>
         </w:rPr>
-        <w:t xml:space="preserve">2 asistencias: </w:t>
-      </w:r>
-      <w:r>
-        <w:t xml:space="preserve">Un nuevo ingreso puede seguir asistiendo, pero en el pase de lista se ve su cuenta ("1.ª asist. · nuevo", "2.ª asist. · debe registrarse"). Al cerrar la lista donde llega a 2 asistencias sin registro pagado, el sistema avisa una sola vez a los jefes de su sección y a tesorería (mensaje y tarea "Cobrar registro de nuevo ingreso").</w:t>
+        <w:t xml:space="preserve">Promesa = Tercera clase: </w:t>
+      </w:r>
+      <w:r>
+        <w:t xml:space="preserve">En Tropa la Promesa y la Tercera clase son el mismo adelanto: aparece como "Promesa (Tercera clase)" en adelantos, logros y la ficha. Quien tenía registrada la Tercera clase quedó con su Promesa.</w:t>
       </w:r>
     </w:p>
     <w:p>
@@ -5866,9 +6022,9 @@
       <w:r>
         <w:drawing>
           <wp:inline distT="0" distB="0" distL="0" distR="0">
-            <wp:extent cx="5715000" cy="2238375"/>
+            <wp:extent cx="5715000" cy="4857750"/>
             <wp:effectExtent t="0" r="0" b="0" l="0"/>
-            <wp:docPr id="1" name="21_nuevo_ingreso.jpg" descr="Nuevo ingreso, firma del tutor, liga de pago y programa enviado al consejo" title="Nuevo ingreso, firma del tutor, liga de pago y programa enviado al consejo"/>
+            <wp:docPr id="1" name="22_liga_papas.jpg" descr="Ficha de la familia con sección propuesta, elección de pago y liga con QR para compartir" title="Ficha de la familia con sección propuesta, elección de pago y liga con QR para compartir"/>
             <wp:cNvGraphicFramePr>
               <a:graphicFrameLocks xmlns:a="http://schemas.openxmlformats.org/drawingml/2006/main" noChangeAspect="1"/>
             </wp:cNvGraphicFramePr>
@@ -5891,6 +6047,238 @@
                   <pic:spPr bwMode="auto">
                     <a:xfrm>
                       <a:off x="0" y="0"/>
+                      <a:ext cx="5715000" cy="4857750"/>
+                    </a:xfrm>
+                    <a:prstGeom prst="rect">
+                      <a:avLst/>
+                    </a:prstGeom>
+                  </pic:spPr>
+                </pic:pic>
+              </a:graphicData>
+            </a:graphic>
+          </wp:inline>
+        </w:drawing>
+      </w:r>
+    </w:p>
+    <w:p>
+      <w:pPr>
+        <w:spacing w:after="200"/>
+        <w:jc w:val="center"/>
+      </w:pPr>
+      <w:r>
+        <w:rPr>
+          <w:i/>
+          <w:iCs/>
+          <w:color w:val="666666"/>
+          <w:sz w:val="18"/>
+          <w:szCs w:val="18"/>
+        </w:rPr>
+        <w:t xml:space="preserve">Ficha de la familia con sección propuesta, elección de pago y liga con QR para compartir</w:t>
+      </w:r>
+    </w:p>
+    <w:p>
+      <w:pPr>
+        <w:pStyle w:val="Heading2"/>
+      </w:pPr>
+      <w:r>
+        <w:t xml:space="preserve">Recibir a quien pasa de sección, colores de patrulla y especialidades por colores</w:t>
+      </w:r>
+    </w:p>
+    <w:p>
+      <w:pPr>
+        <w:pStyle w:val="ListParagraph"/>
+        <w:numPr>
+          <w:ilvl w:val="0"/>
+          <w:numId w:val="17"/>
+        </w:numPr>
+        <w:spacing w:after="80" w:line="290"/>
+      </w:pPr>
+      <w:r>
+        <w:rPr>
+          <w:b/>
+          <w:bCs/>
+        </w:rPr>
+        <w:t xml:space="preserve">Ya ingresó. </w:t>
+      </w:r>
+      <w:r>
+        <w:t xml:space="preserve">Rutas de enlace → "Recibiré": cuando el scout ya llegó, el jefe que lo recibe toca "Ya ingresó a mi sección". Pasa a la sección sin patrulla y aparece en Patrullas y cargos como "Recién llegado"; el jefe le asigna su patrulla cuando corresponda.</w:t>
+      </w:r>
+    </w:p>
+    <w:p>
+      <w:pPr>
+        <w:pStyle w:val="ListParagraph"/>
+        <w:numPr>
+          <w:ilvl w:val="0"/>
+          <w:numId w:val="17"/>
+        </w:numPr>
+        <w:spacing w:after="80" w:line="290"/>
+      </w:pPr>
+      <w:r>
+        <w:rPr>
+          <w:b/>
+          <w:bCs/>
+        </w:rPr>
+        <w:t xml:space="preserve">Colores de patrulla, seisena o madriguera. </w:t>
+      </w:r>
+      <w:r>
+        <w:t xml:space="preserve">Patrullas y cargos → lápiz junto al nombre del equipo: cambia nombre y color. El color se usa en el tablero y en las fichas. En Odoo: Sección → pestaña de patrullas, columna Color.</w:t>
+      </w:r>
+    </w:p>
+    <w:p>
+      <w:pPr>
+        <w:pStyle w:val="ListParagraph"/>
+        <w:numPr>
+          <w:ilvl w:val="0"/>
+          <w:numId w:val="17"/>
+        </w:numPr>
+        <w:spacing w:after="80" w:line="290"/>
+      </w:pPr>
+      <w:r>
+        <w:rPr>
+          <w:b/>
+          <w:bCs/>
+        </w:rPr>
+        <w:t xml:space="preserve">Especialidades por colores y técnicas. </w:t>
+      </w:r>
+      <w:r>
+        <w:t xml:space="preserve">Cuadro de logros → "Especialidades por colores y técnicas": por cada scout y grupo de especialidades, cuántas lleva y el nivel logrado (amarillo, verde, rojo), más correas y técnicas.</w:t>
+      </w:r>
+    </w:p>
+    <w:p>
+      <w:pPr>
+        <w:pStyle w:val="ListParagraph"/>
+        <w:numPr>
+          <w:ilvl w:val="0"/>
+          <w:numId w:val="17"/>
+        </w:numPr>
+        <w:spacing w:after="80" w:line="290"/>
+      </w:pPr>
+      <w:r>
+        <w:rPr>
+          <w:b/>
+          <w:bCs/>
+        </w:rPr>
+        <w:t xml:space="preserve">Ver la ficha completa. </w:t>
+      </w:r>
+      <w:r>
+        <w:t xml:space="preserve">En pase de lista, patrullas, logros, rutas y miembros, toca el nombre de cualquier scout para abrir su ficha: datos personales, familia, ficha médica, adelantos, asistencia y pagos.</w:t>
+      </w:r>
+    </w:p>
+    <w:p>
+      <w:pPr>
+        <w:spacing w:after="60" w:before="120"/>
+        <w:jc w:val="center"/>
+      </w:pPr>
+      <w:r>
+        <w:drawing>
+          <wp:inline distT="0" distB="0" distL="0" distR="0">
+            <wp:extent cx="5334000" cy="6115050"/>
+            <wp:effectExtent t="0" r="0" b="0" l="0"/>
+            <wp:docPr id="1" name="23_colores.jpg" descr="Recién llegados, color de patrulla actualizado y cuadro de especialidades por colores" title="Recién llegados, color de patrulla actualizado y cuadro de especialidades por colores"/>
+            <wp:cNvGraphicFramePr>
+              <a:graphicFrameLocks xmlns:a="http://schemas.openxmlformats.org/drawingml/2006/main" noChangeAspect="1"/>
+            </wp:cNvGraphicFramePr>
+            <a:graphic xmlns:a="http://schemas.openxmlformats.org/drawingml/2006/main">
+              <a:graphicData uri="http://schemas.openxmlformats.org/drawingml/2006/picture">
+                <pic:pic xmlns:pic="http://schemas.openxmlformats.org/drawingml/2006/picture">
+                  <pic:nvPicPr>
+                    <pic:cNvPr id="0" name="" descr=""/>
+                    <pic:cNvPicPr>
+                      <a:picLocks noChangeAspect="1" noChangeArrowheads="1"/>
+                    </pic:cNvPicPr>
+                  </pic:nvPicPr>
+                  <pic:blipFill>
+                    <a:blip r:embed="rId33" cstate="none"/>
+                    <a:srcRect/>
+                    <a:stretch>
+                      <a:fillRect/>
+                    </a:stretch>
+                  </pic:blipFill>
+                  <pic:spPr bwMode="auto">
+                    <a:xfrm>
+                      <a:off x="0" y="0"/>
+                      <a:ext cx="5334000" cy="6115050"/>
+                    </a:xfrm>
+                    <a:prstGeom prst="rect">
+                      <a:avLst/>
+                    </a:prstGeom>
+                  </pic:spPr>
+                </pic:pic>
+              </a:graphicData>
+            </a:graphic>
+          </wp:inline>
+        </w:drawing>
+      </w:r>
+    </w:p>
+    <w:p>
+      <w:pPr>
+        <w:spacing w:after="200"/>
+        <w:jc w:val="center"/>
+      </w:pPr>
+      <w:r>
+        <w:rPr>
+          <w:i/>
+          <w:iCs/>
+          <w:color w:val="666666"/>
+          <w:sz w:val="18"/>
+          <w:szCs w:val="18"/>
+        </w:rPr>
+        <w:t xml:space="preserve">Recién llegados, color de patrulla actualizado y cuadro de especialidades por colores</w:t>
+      </w:r>
+    </w:p>
+    <w:p>
+      <w:pPr>
+        <w:pBdr>
+          <w:left w:val="single" w:color="F36F45" w:sz="24" w:space="8"/>
+        </w:pBdr>
+        <w:shd w:fill="FDF0EA" w:color="auto" w:val="clear"/>
+        <w:spacing w:after="160" w:before="120" w:line="290"/>
+      </w:pPr>
+      <w:r>
+        <w:rPr>
+          <w:b/>
+          <w:bCs/>
+          <w:color w:val="0F3049"/>
+        </w:rPr>
+        <w:t xml:space="preserve">2 asistencias: </w:t>
+      </w:r>
+      <w:r>
+        <w:t xml:space="preserve">Un nuevo ingreso puede seguir asistiendo, pero en el pase de lista se ve su cuenta ("1.ª asist. · nuevo", "2.ª asist. · debe registrarse"). Al cerrar la lista donde llega a 2 asistencias sin registro pagado, el sistema avisa una sola vez a los jefes de su sección y a tesorería (mensaje y tarea "Cobrar registro de nuevo ingreso").</w:t>
+      </w:r>
+    </w:p>
+    <w:p>
+      <w:pPr>
+        <w:spacing w:after="60" w:before="120"/>
+        <w:jc w:val="center"/>
+      </w:pPr>
+      <w:r>
+        <w:drawing>
+          <wp:inline distT="0" distB="0" distL="0" distR="0">
+            <wp:extent cx="5715000" cy="2238375"/>
+            <wp:effectExtent t="0" r="0" b="0" l="0"/>
+            <wp:docPr id="1" name="21_nuevo_ingreso.jpg" descr="Nuevo ingreso, firma del tutor, liga de pago y programa enviado al consejo" title="Nuevo ingreso, firma del tutor, liga de pago y programa enviado al consejo"/>
+            <wp:cNvGraphicFramePr>
+              <a:graphicFrameLocks xmlns:a="http://schemas.openxmlformats.org/drawingml/2006/main" noChangeAspect="1"/>
+            </wp:cNvGraphicFramePr>
+            <a:graphic xmlns:a="http://schemas.openxmlformats.org/drawingml/2006/main">
+              <a:graphicData uri="http://schemas.openxmlformats.org/drawingml/2006/picture">
+                <pic:pic xmlns:pic="http://schemas.openxmlformats.org/drawingml/2006/picture">
+                  <pic:nvPicPr>
+                    <pic:cNvPr id="0" name="" descr=""/>
+                    <pic:cNvPicPr>
+                      <a:picLocks noChangeAspect="1" noChangeArrowheads="1"/>
+                    </pic:cNvPicPr>
+                  </pic:nvPicPr>
+                  <pic:blipFill>
+                    <a:blip r:embed="rId34" cstate="none"/>
+                    <a:srcRect/>
+                    <a:stretch>
+                      <a:fillRect/>
+                    </a:stretch>
+                  </pic:blipFill>
+                  <pic:spPr bwMode="auto">
+                    <a:xfrm>
+                      <a:off x="0" y="0"/>
                       <a:ext cx="5715000" cy="2238375"/>
                     </a:xfrm>
                     <a:prstGeom prst="rect">
@@ -6522,7 +6910,7 @@
         <w:pStyle w:val="ListParagraph"/>
         <w:numPr>
           <w:ilvl w:val="0"/>
-          <w:numId w:val="15"/>
+          <w:numId w:val="18"/>
         </w:numPr>
         <w:spacing w:after="80" w:line="290"/>
       </w:pPr>
@@ -6542,7 +6930,7 @@
         <w:pStyle w:val="ListParagraph"/>
         <w:numPr>
           <w:ilvl w:val="0"/>
-          <w:numId w:val="15"/>
+          <w:numId w:val="18"/>
         </w:numPr>
         <w:spacing w:after="80" w:line="290"/>
       </w:pPr>
@@ -6562,7 +6950,7 @@
         <w:pStyle w:val="ListParagraph"/>
         <w:numPr>
           <w:ilvl w:val="0"/>
-          <w:numId w:val="15"/>
+          <w:numId w:val="18"/>
         </w:numPr>
         <w:spacing w:after="80" w:line="290"/>
       </w:pPr>
@@ -6582,7 +6970,7 @@
         <w:pStyle w:val="ListParagraph"/>
         <w:numPr>
           <w:ilvl w:val="0"/>
-          <w:numId w:val="15"/>
+          <w:numId w:val="18"/>
         </w:numPr>
         <w:spacing w:after="80" w:line="290"/>
       </w:pPr>
@@ -6638,7 +7026,7 @@
         <w:pStyle w:val="ListParagraph"/>
         <w:numPr>
           <w:ilvl w:val="0"/>
-          <w:numId w:val="16"/>
+          <w:numId w:val="19"/>
         </w:numPr>
         <w:spacing w:after="80" w:line="290"/>
       </w:pPr>
@@ -6658,7 +7046,7 @@
         <w:pStyle w:val="ListParagraph"/>
         <w:numPr>
           <w:ilvl w:val="0"/>
-          <w:numId w:val="16"/>
+          <w:numId w:val="19"/>
         </w:numPr>
         <w:spacing w:after="80" w:line="290"/>
       </w:pPr>
@@ -6678,7 +7066,7 @@
         <w:pStyle w:val="ListParagraph"/>
         <w:numPr>
           <w:ilvl w:val="0"/>
-          <w:numId w:val="16"/>
+          <w:numId w:val="19"/>
         </w:numPr>
         <w:spacing w:after="80" w:line="290"/>
       </w:pPr>
@@ -6698,7 +7086,7 @@
         <w:pStyle w:val="ListParagraph"/>
         <w:numPr>
           <w:ilvl w:val="0"/>
-          <w:numId w:val="16"/>
+          <w:numId w:val="19"/>
         </w:numPr>
         <w:spacing w:after="80" w:line="290"/>
       </w:pPr>
@@ -6718,7 +7106,7 @@
         <w:pStyle w:val="ListParagraph"/>
         <w:numPr>
           <w:ilvl w:val="0"/>
-          <w:numId w:val="16"/>
+          <w:numId w:val="19"/>
         </w:numPr>
         <w:spacing w:after="80" w:line="290"/>
       </w:pPr>
@@ -6738,7 +7126,7 @@
         <w:pStyle w:val="ListParagraph"/>
         <w:numPr>
           <w:ilvl w:val="0"/>
-          <w:numId w:val="16"/>
+          <w:numId w:val="19"/>
         </w:numPr>
         <w:spacing w:after="80" w:line="290"/>
       </w:pPr>
@@ -6777,7 +7165,7 @@
                     </pic:cNvPicPr>
                   </pic:nvPicPr>
                   <pic:blipFill>
-                    <a:blip r:embed="rId33" cstate="none"/>
+                    <a:blip r:embed="rId35" cstate="none"/>
                     <a:srcRect/>
                     <a:stretch>
                       <a:fillRect/>
@@ -6859,7 +7247,7 @@
                     </pic:cNvPicPr>
                   </pic:nvPicPr>
                   <pic:blipFill>
-                    <a:blip r:embed="rId34" cstate="none"/>
+                    <a:blip r:embed="rId36" cstate="none"/>
                     <a:srcRect/>
                     <a:stretch>
                       <a:fillRect/>
@@ -6930,7 +7318,7 @@
         <w:pStyle w:val="ListParagraph"/>
         <w:numPr>
           <w:ilvl w:val="0"/>
-          <w:numId w:val="17"/>
+          <w:numId w:val="20"/>
         </w:numPr>
         <w:spacing w:after="80" w:line="290"/>
       </w:pPr>
@@ -6950,7 +7338,7 @@
         <w:pStyle w:val="ListParagraph"/>
         <w:numPr>
           <w:ilvl w:val="0"/>
-          <w:numId w:val="17"/>
+          <w:numId w:val="20"/>
         </w:numPr>
         <w:spacing w:after="80" w:line="290"/>
       </w:pPr>
@@ -6970,7 +7358,7 @@
         <w:pStyle w:val="ListParagraph"/>
         <w:numPr>
           <w:ilvl w:val="0"/>
-          <w:numId w:val="17"/>
+          <w:numId w:val="20"/>
         </w:numPr>
         <w:spacing w:after="80" w:line="290"/>
       </w:pPr>
@@ -6990,7 +7378,7 @@
         <w:pStyle w:val="ListParagraph"/>
         <w:numPr>
           <w:ilvl w:val="0"/>
-          <w:numId w:val="17"/>
+          <w:numId w:val="20"/>
         </w:numPr>
         <w:spacing w:after="80" w:line="290"/>
       </w:pPr>
@@ -7010,7 +7398,7 @@
         <w:pStyle w:val="ListParagraph"/>
         <w:numPr>
           <w:ilvl w:val="0"/>
-          <w:numId w:val="17"/>
+          <w:numId w:val="20"/>
         </w:numPr>
         <w:spacing w:after="80" w:line="290"/>
       </w:pPr>
@@ -7023,7 +7411,7 @@
         <w:pStyle w:val="ListParagraph"/>
         <w:numPr>
           <w:ilvl w:val="0"/>
-          <w:numId w:val="17"/>
+          <w:numId w:val="20"/>
         </w:numPr>
         <w:spacing w:after="80" w:line="290"/>
       </w:pPr>
@@ -7148,7 +7536,7 @@
         <w:pStyle w:val="ListParagraph"/>
         <w:numPr>
           <w:ilvl w:val="0"/>
-          <w:numId w:val="18"/>
+          <w:numId w:val="21"/>
         </w:numPr>
         <w:spacing w:after="80" w:line="290"/>
       </w:pPr>
@@ -7161,7 +7549,7 @@
         <w:pStyle w:val="ListParagraph"/>
         <w:numPr>
           <w:ilvl w:val="0"/>
-          <w:numId w:val="18"/>
+          <w:numId w:val="21"/>
         </w:numPr>
         <w:spacing w:after="80" w:line="290"/>
       </w:pPr>
@@ -7174,7 +7562,7 @@
         <w:pStyle w:val="ListParagraph"/>
         <w:numPr>
           <w:ilvl w:val="0"/>
-          <w:numId w:val="18"/>
+          <w:numId w:val="21"/>
         </w:numPr>
         <w:spacing w:after="80" w:line="290"/>
       </w:pPr>
@@ -7187,7 +7575,7 @@
         <w:pStyle w:val="ListParagraph"/>
         <w:numPr>
           <w:ilvl w:val="0"/>
-          <w:numId w:val="18"/>
+          <w:numId w:val="21"/>
         </w:numPr>
         <w:spacing w:after="80" w:line="290"/>
       </w:pPr>
@@ -7200,7 +7588,7 @@
         <w:pStyle w:val="ListParagraph"/>
         <w:numPr>
           <w:ilvl w:val="0"/>
-          <w:numId w:val="18"/>
+          <w:numId w:val="21"/>
         </w:numPr>
         <w:spacing w:after="80" w:line="290"/>
       </w:pPr>
@@ -8442,6 +8830,42 @@
     </w:lvl>
   </w:abstractNum>
   <w:abstractNum w:abstractNumId="18" w15:restartNumberingAfterBreak="0">
+    <w:multiLevelType w:val="hybridMultilevel"/>
+    <w:lvl w:ilvl="0" w15:tentative="1">
+      <w:start w:val="1"/>
+      <w:numFmt w:val="decimal"/>
+      <w:lvlText w:val="%1."/>
+      <w:lvlJc w:val="left"/>
+      <w:pPr>
+        <w:ind w:left="720" w:hanging="360"/>
+      </w:pPr>
+    </w:lvl>
+  </w:abstractNum>
+  <w:abstractNum w:abstractNumId="19" w15:restartNumberingAfterBreak="0">
+    <w:multiLevelType w:val="hybridMultilevel"/>
+    <w:lvl w:ilvl="0" w15:tentative="1">
+      <w:start w:val="1"/>
+      <w:numFmt w:val="decimal"/>
+      <w:lvlText w:val="%1."/>
+      <w:lvlJc w:val="left"/>
+      <w:pPr>
+        <w:ind w:left="720" w:hanging="360"/>
+      </w:pPr>
+    </w:lvl>
+  </w:abstractNum>
+  <w:abstractNum w:abstractNumId="20" w15:restartNumberingAfterBreak="0">
+    <w:multiLevelType w:val="hybridMultilevel"/>
+    <w:lvl w:ilvl="0" w15:tentative="1">
+      <w:start w:val="1"/>
+      <w:numFmt w:val="decimal"/>
+      <w:lvlText w:val="%1."/>
+      <w:lvlJc w:val="left"/>
+      <w:pPr>
+        <w:ind w:left="720" w:hanging="360"/>
+      </w:pPr>
+    </w:lvl>
+  </w:abstractNum>
+  <w:abstractNum w:abstractNumId="21" w15:restartNumberingAfterBreak="0">
     <w:multiLevelType w:val="hybridMultilevel"/>
     <w:lvl w:ilvl="0" w15:tentative="1">
       <w:start w:val="1"/>
@@ -8557,6 +8981,24 @@
   </w:num>
   <w:num w:numId="18">
     <w:abstractNumId w:val="18"/>
+    <w:lvlOverride w:ilvl="0">
+      <w:startOverride w:val="1"/>
+    </w:lvlOverride>
+  </w:num>
+  <w:num w:numId="19">
+    <w:abstractNumId w:val="19"/>
+    <w:lvlOverride w:ilvl="0">
+      <w:startOverride w:val="1"/>
+    </w:lvlOverride>
+  </w:num>
+  <w:num w:numId="20">
+    <w:abstractNumId w:val="20"/>
+    <w:lvlOverride w:ilvl="0">
+      <w:startOverride w:val="1"/>
+    </w:lvlOverride>
+  </w:num>
+  <w:num w:numId="21">
+    <w:abstractNumId w:val="21"/>
     <w:lvlOverride w:ilvl="0">
       <w:startOverride w:val="1"/>
     </w:lvlOverride>

</xml_diff>